<commit_message>
Align the complete Traditional Chinese paper
</commit_message>
<xml_diff>
--- a/paper/tact_zh_complete.docx
+++ b/paper/tact_zh_complete.docx
@@ -785,7 +785,7 @@
         <w:rPr>
           <w:rFonts w:hint="eastAsia"/>
         </w:rPr>
-        <w:t xml:space="preserve">，見第三節）足以將信心加權基線從近乎完美壓到多數決基準線；但同一份證據若以正確的符號解讀，其實是近乎完美的訊號。另一種防禦性作法是在校準誤差過高時以二元閘門關閉信心通道，此法雖可在符號反轉下存活，卻會把仍具辨別力的訊號一併丟棄：一條系統性偏低但排序完全正確的信心通道，會因與投票效用無關的理由而未能通過</w:t>
+        <w:t xml:space="preserve">，見第三節）足以將信心加權基線從近乎完美壓到遠低於多數決基準線；但同一份證據若以正確的符號解讀，其實是完美訊號。另一種防禦性作法是在校準誤差過高時以二元閘門關閉信心通道，此法雖可在符號反轉下存活，卻會把仍具辨別力的訊號一併丟棄：一條系統性偏低但排序完全正確的信心通道，會因與投票效用無關的理由而未能通過</w:t>
       </w:r>
       <w:r>
         <w:t xml:space="preserve"> ECE </w:t>
@@ -1053,16 +1053,7 @@
         <w:rPr>
           <w:rFonts w:hint="eastAsia"/>
         </w:rPr>
-        <w:t xml:space="preserve">），配上精確的</w:t>
-      </w:r>
-      <w:r>
-        <w:t xml:space="preserve"> tie </w:t>
-      </w:r>
-      <w:r>
-        <w:rPr>
-          <w:rFonts w:hint="eastAsia"/>
-        </w:rPr>
-        <w:t xml:space="preserve">校正零假設變異數與題內叢集</w:t>
+        <w:t xml:space="preserve">），配上精確的同分校正零假設變異數與題目叢集</w:t>
       </w:r>
       <w:r>
         <w:t xml:space="preserve"> jackknife </w:t>
@@ -1080,7 +1071,7 @@
         <w:rPr>
           <w:rFonts w:hint="eastAsia"/>
         </w:rPr>
-        <w:t xml:space="preserve">收縮，最後經含混合變異數校正的</w:t>
+        <w:t xml:space="preserve">收縮，最後經</w:t>
       </w:r>
       <w:r>
         <w:t xml:space="preserve"> Bayes </w:t>
@@ -1124,7 +1115,72 @@
         <w:rPr>
           <w:rFonts w:hint="eastAsia"/>
         </w:rPr>
-        <w:t xml:space="preserve">僅透過題內排名依賴信心，任何嚴格單調的信心尺度失真都不影響投票；在單調壓縮情形下，本方法超越了整個原始值權重家族所能達到的最佳結果（</w:t>
+        <w:t xml:space="preserve">僅透過題內排名依賴信心，任何嚴格單調的信心尺度失真都不影響投票；在單調壓縮情形下，本方法勝過測試網格</w:t>
+      </w:r>
+      <w:r>
+        <w:t xml:space="preserve"> </w:t>
+      </w:r>
+      <m:oMath>
+        <m:r>
+          <m:rPr>
+            <m:sty m:val="p"/>
+          </m:rPr>
+          <m:t>{</m:t>
+        </m:r>
+        <m:r>
+          <m:t>0.25</m:t>
+        </m:r>
+        <m:r>
+          <m:rPr>
+            <m:sty m:val="p"/>
+          </m:rPr>
+          <m:t>,</m:t>
+        </m:r>
+        <m:r>
+          <m:t>0.5</m:t>
+        </m:r>
+        <m:r>
+          <m:rPr>
+            <m:sty m:val="p"/>
+          </m:rPr>
+          <m:t>,</m:t>
+        </m:r>
+        <m:r>
+          <m:t>1</m:t>
+        </m:r>
+        <m:r>
+          <m:rPr>
+            <m:sty m:val="p"/>
+          </m:rPr>
+          <m:t>,</m:t>
+        </m:r>
+        <m:r>
+          <m:t>2</m:t>
+        </m:r>
+        <m:r>
+          <m:rPr>
+            <m:sty m:val="p"/>
+          </m:rPr>
+          <m:t>,</m:t>
+        </m:r>
+        <m:r>
+          <m:t>4</m:t>
+        </m:r>
+        <m:r>
+          <m:rPr>
+            <m:sty m:val="p"/>
+          </m:rPr>
+          <m:t>}</m:t>
+        </m:r>
+      </m:oMath>
+      <w:r>
+        <w:t xml:space="preserve"> </w:t>
+      </w:r>
+      <w:r>
+        <w:rPr>
+          <w:rFonts w:hint="eastAsia"/>
+        </w:rPr>
+        <w:t xml:space="preserve">中最好的指數（</w:t>
       </w:r>
       <m:oMath>
         <m:r>
@@ -1152,7 +1208,7 @@
         <w:rPr>
           <w:rFonts w:hint="eastAsia"/>
         </w:rPr>
-        <w:t xml:space="preserve">）。</w:t>
+        <w:t xml:space="preserve">）。該格的最佳點位於網格所試的最大指數，因此這項比較界定的是此網格，而不是整個原始值權重家族。</w:t>
       </w:r>
     </w:p>
     <w:p>
@@ -1665,6 +1721,177 @@
         <w:t xml:space="preserve">的自助法區間確立為系統性而非雜訊。</w:t>
       </w:r>
     </w:p>
+    <w:p>
+      <w:pPr>
+        <w:pStyle w:val="BodyText"/>
+      </w:pPr>
+      <w:r>
+        <w:rPr>
+          <w:rFonts w:hint="eastAsia"/>
+          <w:b/>
+          <w:bCs/>
+        </w:rPr>
+        <w:t xml:space="preserve">C5：量測可作用的分層。</w:t>
+      </w:r>
+      <w:r>
+        <w:t xml:space="preserve"> </w:t>
+      </w:r>
+      <w:r>
+        <w:rPr>
+          <w:rFonts w:hint="eastAsia"/>
+        </w:rPr>
+        <w:t xml:space="preserve">兩次真實軌跡實驗與五個基質的窗口量測，界定了任何無標籤聚合方法實際能處理的範圍。通道在飽和基準上為零（</w:t>
+      </w:r>
+      <m:oMath>
+        <m:acc>
+          <m:accPr>
+            <m:chr m:val="̂"/>
+          </m:accPr>
+          <m:e>
+            <m:r>
+              <m:t>D</m:t>
+            </m:r>
+          </m:e>
+        </m:acc>
+        <m:r>
+          <m:rPr>
+            <m:sty m:val="p"/>
+          </m:rPr>
+          <m:t>=</m:t>
+        </m:r>
+        <m:r>
+          <m:rPr>
+            <m:sty m:val="p"/>
+          </m:rPr>
+          <m:t>−</m:t>
+        </m:r>
+        <m:r>
+          <m:t>0.219</m:t>
+        </m:r>
+      </m:oMath>
+      <w:r>
+        <w:t xml:space="preserve">、</w:t>
+      </w:r>
+      <m:oMath>
+        <m:r>
+          <m:t>z</m:t>
+        </m:r>
+        <m:r>
+          <m:rPr>
+            <m:sty m:val="p"/>
+          </m:rPr>
+          <m:t>=</m:t>
+        </m:r>
+        <m:r>
+          <m:rPr>
+            <m:sty m:val="p"/>
+          </m:rPr>
+          <m:t>−</m:t>
+        </m:r>
+        <m:r>
+          <m:t>1.24</m:t>
+        </m:r>
+      </m:oMath>
+      <w:r>
+        <w:rPr>
+          <w:rFonts w:hint="eastAsia"/>
+        </w:rPr>
+        <w:t xml:space="preserve">），在競賽數學上為正（</w:t>
+      </w:r>
+      <m:oMath>
+        <m:acc>
+          <m:accPr>
+            <m:chr m:val="̂"/>
+          </m:accPr>
+          <m:e>
+            <m:r>
+              <m:t>D</m:t>
+            </m:r>
+          </m:e>
+        </m:acc>
+        <m:r>
+          <m:rPr>
+            <m:sty m:val="p"/>
+          </m:rPr>
+          <m:t>=</m:t>
+        </m:r>
+        <m:r>
+          <m:rPr>
+            <m:sty m:val="p"/>
+          </m:rPr>
+          <m:t>+</m:t>
+        </m:r>
+        <m:r>
+          <m:t>0.250</m:t>
+        </m:r>
+      </m:oMath>
+      <w:r>
+        <w:t xml:space="preserve">、</w:t>
+      </w:r>
+      <m:oMath>
+        <m:r>
+          <m:t>z</m:t>
+        </m:r>
+        <m:r>
+          <m:rPr>
+            <m:sty m:val="p"/>
+          </m:rPr>
+          <m:t>=</m:t>
+        </m:r>
+        <m:r>
+          <m:rPr>
+            <m:sty m:val="p"/>
+          </m:rPr>
+          <m:t>+</m:t>
+        </m:r>
+        <m:r>
+          <m:t>2.54</m:t>
+        </m:r>
+      </m:oMath>
+      <w:r>
+        <w:rPr>
+          <w:rFonts w:hint="eastAsia"/>
+        </w:rPr>
+        <w:t xml:space="preserve">），顯示模型不確定時，方法所需的前提確實可能成立；但跨兩個領域五個基質，可作用的分層仍只佔題目的</w:t>
+      </w:r>
+      <w:r>
+        <w:t xml:space="preserve"> </w:t>
+      </w:r>
+      <m:oMath>
+        <m:r>
+          <m:t>2.5</m:t>
+        </m:r>
+      </m:oMath>
+      <w:r>
+        <w:t xml:space="preserve">–</w:t>
+      </w:r>
+      <m:oMath>
+        <m:r>
+          <m:t>7.5</m:t>
+        </m:r>
+        <m:r>
+          <m:rPr>
+            <m:sty m:val="p"/>
+          </m:rPr>
+          <m:t>%</m:t>
+        </m:r>
+      </m:oMath>
+      <w:r>
+        <w:rPr>
+          <w:rFonts w:hint="eastAsia"/>
+        </w:rPr>
+        <w:t xml:space="preserve">，而且題目變難時沒有變寬。兩個真實基質上的池內</w:t>
+      </w:r>
+      <w:r>
+        <w:t xml:space="preserve"> oracle </w:t>
+      </w:r>
+      <w:r>
+        <w:rPr>
+          <w:rFonts w:hint="eastAsia"/>
+        </w:rPr>
+        <w:t xml:space="preserve">都無法通過預先登記的終點，因此棄權是正確的預設。</w:t>
+      </w:r>
+    </w:p>
     <w:bookmarkEnd w:id="10"/>
     <w:bookmarkStart w:id="11" w:name="二相關工作"/>
     <w:p>
@@ -1783,14 +2010,6 @@
             <w:rStyle w:val="Hyperlink"/>
           </w:rPr>
           <w:t xml:space="preserve">[11]</w:t>
-        </w:r>
-      </w:hyperlink>
-      <w:hyperlink w:anchor="ref14">
-        <w:r>
-          <w:rPr>
-            <w:rStyle w:val="Hyperlink"/>
-          </w:rPr>
-          <w:t xml:space="preserve">[14]</w:t>
         </w:r>
       </w:hyperlink>
       <w:r>
@@ -1828,7 +2047,27 @@
         <w:rPr>
           <w:rFonts w:hint="eastAsia"/>
         </w:rPr>
-        <w:t xml:space="preserve">著眼於預算效率；可靠度感知偽計數</w:t>
+        <w:t xml:space="preserve">著眼於預算效率。Self-Certainty</w:t>
+      </w:r>
+      <w:r>
+        <w:t xml:space="preserve"> </w:t>
+      </w:r>
+      <w:hyperlink w:anchor="ref14">
+        <w:r>
+          <w:rPr>
+            <w:rStyle w:val="Hyperlink"/>
+          </w:rPr>
+          <w:t xml:space="preserve">[14]</w:t>
+        </w:r>
+      </w:hyperlink>
+      <w:r>
+        <w:t xml:space="preserve"> </w:t>
+      </w:r>
+      <w:r>
+        <w:rPr>
+          <w:rFonts w:hint="eastAsia"/>
+        </w:rPr>
+        <w:t xml:space="preserve">在概念上最接近本文，因為它是已發表候選選擇器中唯一採用近似排名分數的方法；但它跨候選項目排名、方向固定為正，本文也沒有把它列入評測。可靠度感知偽計數</w:t>
       </w:r>
       <w:r>
         <w:t xml:space="preserve"> </w:t>
@@ -1868,7 +2107,68 @@
         <w:rPr>
           <w:rFonts w:hint="eastAsia"/>
         </w:rPr>
-        <w:t xml:space="preserve">可線上調整，但僅能縮放正向信任。上述方法皆無法表達（更遑論估計）負的信心與正確性關聯。基於此，本文的</w:t>
+        <w:t xml:space="preserve">可線上調整，但僅能重新縮放正向信任。上述方法都不搜尋負指數；障礙在超參數網格少了一個符號位元，不在權重家族本身。本文自己的</w:t>
+      </w:r>
+      <w:r>
+        <w:t xml:space="preserve"> SignGrid-dev </w:t>
+      </w:r>
+      <w:r>
+        <w:rPr>
+          <w:rFonts w:hint="eastAsia"/>
+        </w:rPr>
+        <w:t xml:space="preserve">基線把同一個</w:t>
+      </w:r>
+      <w:r>
+        <w:t xml:space="preserve"> </w:t>
+      </w:r>
+      <m:oMath>
+        <m:sSup>
+          <m:e>
+            <m:r>
+              <m:t>c</m:t>
+            </m:r>
+          </m:e>
+          <m:sup>
+            <m:r>
+              <m:t>γ</m:t>
+            </m:r>
+          </m:sup>
+        </m:sSup>
+      </m:oMath>
+      <w:r>
+        <w:t xml:space="preserve"> </w:t>
+      </w:r>
+      <w:r>
+        <w:rPr>
+          <w:rFonts w:hint="eastAsia"/>
+        </w:rPr>
+        <w:t xml:space="preserve">家族開放至負</w:t>
+      </w:r>
+      <w:r>
+        <w:t xml:space="preserve"> </w:t>
+      </w:r>
+      <m:oMath>
+        <m:r>
+          <m:t>γ</m:t>
+        </m:r>
+      </m:oMath>
+      <w:r>
+        <w:t xml:space="preserve"> </w:t>
+      </w:r>
+      <w:r>
+        <w:rPr>
+          <w:rFonts w:hint="eastAsia"/>
+        </w:rPr>
+        <w:t xml:space="preserve">後，即可在整條負半軸達到帶符號</w:t>
+      </w:r>
+      <w:r>
+        <w:t xml:space="preserve"> </w:t>
+      </w:r>
+      <w:r>
+        <w:rPr>
+          <w:rFonts w:hint="eastAsia"/>
+        </w:rPr>
+        <w:t xml:space="preserve">oracle。現有協定沒有任何一個會估計這個符號，不論有沒有標籤。基於此，本文的</w:t>
       </w:r>
       <w:r>
         <w:t xml:space="preserve"> dev </w:t>
@@ -2206,7 +2506,16 @@
         <w:rPr>
           <w:rFonts w:hint="eastAsia"/>
         </w:rPr>
-        <w:t xml:space="preserve">設題目</w:t>
+        <w:t xml:space="preserve">本文使用的全部符號依首次出現順序整理於附錄的表</w:t>
+      </w:r>
+      <w:r>
+        <w:t xml:space="preserve"> </w:t>
+      </w:r>
+      <w:r>
+        <w:rPr>
+          <w:rFonts w:hint="eastAsia"/>
+        </w:rPr>
+        <w:t xml:space="preserve">7，並依首次引入符號的章節分組。設題目</w:t>
       </w:r>
       <w:r>
         <w:t xml:space="preserve"> </w:t>
@@ -6651,7 +6960,10 @@
         <w:rPr>
           <w:rFonts w:hint="eastAsia"/>
         </w:rPr>
-        <w:t xml:space="preserve">時會低估強通道的權重約五成。此處需說明常態性假設的實際地位：</w:t>
+        <w:t xml:space="preserve">時會低估強通道的權重約五成。連結假設題內</w:t>
+      </w:r>
+      <w:r>
+        <w:t xml:space="preserve"> </w:t>
       </w:r>
       <m:oMath>
         <m:r>
@@ -6665,7 +6977,74 @@
         <w:rPr>
           <w:rFonts w:hint="eastAsia"/>
         </w:rPr>
-        <w:t xml:space="preserve">在有限的</w:t>
+        <w:t xml:space="preserve">服從常態分布，但式（4.1）的</w:t>
+      </w:r>
+      <w:r>
+        <w:t xml:space="preserve"> normal score </w:t>
+      </w:r>
+      <w:r>
+        <w:rPr>
+          <w:rFonts w:hint="eastAsia"/>
+        </w:rPr>
+        <w:t xml:space="preserve">只有在漸近下才提供這項近似；</w:t>
+      </w:r>
+      <m:oMath>
+        <m:sSub>
+          <m:e>
+            <m:r>
+              <m:t>m</m:t>
+            </m:r>
+          </m:e>
+          <m:sub>
+            <m:r>
+              <m:t>q</m:t>
+            </m:r>
+          </m:sub>
+        </m:sSub>
+        <m:r>
+          <m:rPr>
+            <m:sty m:val="p"/>
+          </m:rPr>
+          <m:t>=</m:t>
+        </m:r>
+        <m:r>
+          <m:t>4</m:t>
+        </m:r>
+      </m:oMath>
+      <w:r>
+        <w:t xml:space="preserve"> </w:t>
+      </w:r>
+      <w:r>
+        <w:rPr>
+          <w:rFonts w:hint="eastAsia"/>
+        </w:rPr>
+        <w:t xml:space="preserve">時，標準化前的分數只有四個可能值。採用實測</w:t>
+      </w:r>
+      <w:r>
+        <w:t xml:space="preserve"> </w:t>
+      </w:r>
+      <m:oMath>
+        <m:sSub>
+          <m:e>
+            <m:r>
+              <m:t>σ</m:t>
+            </m:r>
+          </m:e>
+          <m:sub>
+            <m:r>
+              <m:t>q</m:t>
+            </m:r>
+          </m:sub>
+        </m:sSub>
+      </m:oMath>
+      <w:r>
+        <w:t xml:space="preserve"> </w:t>
+      </w:r>
+      <w:r>
+        <w:rPr>
+          <w:rFonts w:hint="eastAsia"/>
+        </w:rPr>
+        <w:t xml:space="preserve">能修正尺度影響，卻沒有解決分布形狀的誤差。這個問題在本文主張的小預算設定中最尖銳：估計可在</w:t>
       </w:r>
       <w:r>
         <w:t xml:space="preserve"> </w:t>
@@ -6674,15 +7053,27 @@
         <m:r>
           <m:t>m</m:t>
         </m:r>
-      </m:oMath>
-      <w:r>
-        <w:t xml:space="preserve"> </w:t>
-      </w:r>
-      <w:r>
-        <w:rPr>
-          <w:rFonts w:hint="eastAsia"/>
-        </w:rPr>
-        <w:t xml:space="preserve">下只取有限多個值（</w:t>
+        <m:r>
+          <m:rPr>
+            <m:sty m:val="p"/>
+          </m:rPr>
+          <m:t>=</m:t>
+        </m:r>
+        <m:r>
+          <m:t>40</m:t>
+        </m:r>
+      </m:oMath>
+      <w:r>
+        <w:t xml:space="preserve"> </w:t>
+      </w:r>
+      <w:r>
+        <w:rPr>
+          <w:rFonts w:hint="eastAsia"/>
+        </w:rPr>
+        <w:t xml:space="preserve">完成，部署卻可能只有</w:t>
+      </w:r>
+      <w:r>
+        <w:t xml:space="preserve"> </w:t>
       </w:r>
       <m:oMath>
         <m:r>
@@ -6695,17 +7086,55 @@
           <m:t>=</m:t>
         </m:r>
         <m:r>
-          <m:t>4</m:t>
-        </m:r>
-      </m:oMath>
-      <w:r>
-        <w:t xml:space="preserve"> </w:t>
-      </w:r>
-      <w:r>
-        <w:rPr>
-          <w:rFonts w:hint="eastAsia"/>
-        </w:rPr>
-        <w:t xml:space="preserve">時僅四個），所以連結是一個工作模型而非精確描述；它的正當性來自端點性質與實測，不來自漸近論證。</w:t>
+          <m:t>8</m:t>
+        </m:r>
+      </m:oMath>
+      <w:r>
+        <w:rPr>
+          <w:rFonts w:hint="eastAsia"/>
+        </w:rPr>
+        <w:t xml:space="preserve">。當</w:t>
+      </w:r>
+      <w:r>
+        <w:t xml:space="preserve"> </w:t>
+      </w:r>
+      <m:oMath>
+        <m:acc>
+          <m:accPr>
+            <m:chr m:val="̂"/>
+          </m:accPr>
+          <m:e>
+            <m:r>
+              <m:t>D</m:t>
+            </m:r>
+          </m:e>
+        </m:acc>
+      </m:oMath>
+      <w:r>
+        <w:t xml:space="preserve"> </w:t>
+      </w:r>
+      <w:r>
+        <w:rPr>
+          <w:rFonts w:hint="eastAsia"/>
+        </w:rPr>
+        <w:t xml:space="preserve">飽和、指數碰到上限時，連結形狀不再重要；小</w:t>
+      </w:r>
+      <w:r>
+        <w:t xml:space="preserve"> </w:t>
+      </w:r>
+      <m:oMath>
+        <m:r>
+          <m:t>m</m:t>
+        </m:r>
+      </m:oMath>
+      <w:r>
+        <w:t xml:space="preserve"> </w:t>
+      </w:r>
+      <w:r>
+        <w:rPr>
+          <w:rFonts w:hint="eastAsia"/>
+        </w:rPr>
+        <w:t xml:space="preserve">才是它必須有效、同時理據最弱的地方。</w:t>
       </w:r>
     </w:p>
     <w:bookmarkEnd w:id="20"/>
@@ -7540,42 +7969,49 @@
             </m:sup>
           </m:sSup>
           <m:r>
-            <m:rPr>
-              <m:sty m:val="p"/>
-            </m:rPr>
-            <m:t>(</m:t>
+            <m:t>​</m:t>
           </m:r>
-          <m:acc>
-            <m:accPr>
-              <m:chr m:val="̂"/>
-            </m:accPr>
+          <m:d>
+            <m:dPr>
+              <m:begChr m:val="("/>
+              <m:sepChr m:val=""/>
+              <m:endChr m:val=")"/>
+              <m:grow/>
+            </m:dPr>
             <m:e>
-              <m:r>
-                <m:rPr>
-                  <m:sty m:val="p"/>
-                </m:rPr>
-                <m:t>A</m:t>
-              </m:r>
-              <m:r>
-                <m:rPr>
-                  <m:sty m:val="p"/>
-                </m:rPr>
-                <m:t>U</m:t>
-              </m:r>
-              <m:r>
-                <m:rPr>
-                  <m:sty m:val="p"/>
-                </m:rPr>
-                <m:t>C</m:t>
-              </m:r>
+              <m:f>
+                <m:fPr>
+                  <m:type m:val="lin"/>
+                </m:fPr>
+                <m:num>
+                  <m:r>
+                    <m:t>1</m:t>
+                  </m:r>
+                  <m:r>
+                    <m:rPr>
+                      <m:sty m:val="p"/>
+                    </m:rPr>
+                    <m:t>+</m:t>
+                  </m:r>
+                  <m:acc>
+                    <m:accPr>
+                      <m:chr m:val="̃"/>
+                    </m:accPr>
+                    <m:e>
+                      <m:r>
+                        <m:t>D</m:t>
+                      </m:r>
+                    </m:e>
+                  </m:acc>
+                </m:num>
+                <m:den>
+                  <m:r>
+                    <m:t>2</m:t>
+                  </m:r>
+                </m:den>
+              </m:f>
             </m:e>
-          </m:acc>
-          <m:r>
-            <m:rPr>
-              <m:sty m:val="p"/>
-            </m:rPr>
-            <m:t>)</m:t>
-          </m:r>
+          </m:d>
         </m:oMath>
       </m:oMathPara>
     </w:p>
@@ -9408,7 +9844,7 @@
         <m:sSub>
           <m:e>
             <m:r>
-              <m:t>κ</m:t>
+              <m:t>λ</m:t>
             </m:r>
           </m:e>
           <m:sub>
@@ -9454,13 +9890,16 @@
         <w:rPr>
           <w:rFonts w:hint="eastAsia"/>
         </w:rPr>
-        <w:t xml:space="preserve">（</w:t>
+        <w:t xml:space="preserve">，其中</w:t>
+      </w:r>
+      <w:r>
+        <w:t xml:space="preserve"> </w:t>
       </w:r>
       <m:oMath>
         <m:sSub>
           <m:e>
             <m:r>
-              <m:t>κ</m:t>
+              <m:t>λ</m:t>
             </m:r>
           </m:e>
           <m:sub>
@@ -9486,7 +9925,24 @@
         <w:rPr>
           <w:rFonts w:hint="eastAsia"/>
         </w:rPr>
-        <w:t xml:space="preserve">為逐題常數），故</w:t>
+        <w:t xml:space="preserve">為逐題常數，與信心模型中的耦合</w:t>
+      </w:r>
+      <w:r>
+        <w:t xml:space="preserve"> </w:t>
+      </w:r>
+      <m:oMath>
+        <m:r>
+          <m:t>κ</m:t>
+        </m:r>
+      </m:oMath>
+      <w:r>
+        <w:t xml:space="preserve"> </w:t>
+      </w:r>
+      <w:r>
+        <w:rPr>
+          <w:rFonts w:hint="eastAsia"/>
+        </w:rPr>
+        <w:t xml:space="preserve">不同；故</w:t>
       </w:r>
       <w:r>
         <w:t xml:space="preserve"> </w:t>
@@ -12502,31 +12958,16 @@
           <w:b/>
           <w:bCs/>
         </w:rPr>
-        <w:t xml:space="preserve">命題</w:t>
-      </w:r>
-      <w:r>
-        <w:rPr>
-          <w:b/>
-          <w:bCs/>
-        </w:rPr>
-        <w:t xml:space="preserve"> </w:t>
-      </w:r>
-      <w:r>
-        <w:rPr>
-          <w:rFonts w:hint="eastAsia"/>
-          <w:b/>
-          <w:bCs/>
-        </w:rPr>
-        <w:t xml:space="preserve">6（贏家詛咒）。</w:t>
-      </w:r>
-      <w:r>
-        <w:t xml:space="preserve"> </w:t>
-      </w:r>
-      <w:r>
-        <w:rPr>
-          <w:rFonts w:hint="eastAsia"/>
-        </w:rPr>
-        <w:t xml:space="preserve">在</w:t>
+        <w:t xml:space="preserve">備註（贏家詛咒）。</w:t>
+      </w:r>
+      <w:r>
+        <w:t xml:space="preserve"> </w:t>
+      </w:r>
+      <w:r>
+        <w:rPr>
+          <w:rFonts w:hint="eastAsia"/>
+        </w:rPr>
+        <w:t xml:space="preserve">這是目前實驗架構中的量測，不是定理：在</w:t>
       </w:r>
       <w:r>
         <w:t xml:space="preserve"> </w:t>
@@ -12624,37 +13065,56 @@
           <w:b/>
           <w:bCs/>
         </w:rPr>
-        <w:t xml:space="preserve">7（兩世界不可辨識）。</w:t>
-      </w:r>
-      <w:r>
-        <w:t xml:space="preserve"> </w:t>
-      </w:r>
-      <w:r>
-        <w:rPr>
-          <w:rFonts w:hint="eastAsia"/>
-          <w:b/>
-          <w:bCs/>
-        </w:rPr>
-        <w:t xml:space="preserve">在池實質為二元的條件下</w:t>
-      </w:r>
-      <w:r>
-        <w:rPr>
-          <w:rFonts w:hint="eastAsia"/>
-        </w:rPr>
-        <w:t xml:space="preserve">，對任何觀測</w:t>
-      </w:r>
-      <w:r>
-        <w:t xml:space="preserve"> </w:t>
-      </w:r>
-      <m:oMath>
-        <m:r>
-          <m:rPr>
-            <m:sty m:val="p"/>
-          </m:rPr>
-          <m:t>(</m:t>
-        </m:r>
-        <m:r>
-          <m:t>a</m:t>
+        <w:t xml:space="preserve">6（兩世界不可辨識）。</w:t>
+      </w:r>
+      <w:r>
+        <w:t xml:space="preserve"> </w:t>
+      </w:r>
+      <w:r>
+        <w:rPr>
+          <w:rFonts w:hint="eastAsia"/>
+        </w:rPr>
+        <w:t xml:space="preserve">令</w:t>
+      </w:r>
+      <w:r>
+        <w:t xml:space="preserve"> </w:t>
+      </w:r>
+      <m:oMath>
+        <m:sSub>
+          <m:e>
+            <m:r>
+              <m:t>w</m:t>
+            </m:r>
+          </m:e>
+          <m:sub>
+            <m:r>
+              <m:t>1</m:t>
+            </m:r>
+          </m:sub>
+        </m:sSub>
+        <m:r>
+          <m:rPr>
+            <m:sty m:val="p"/>
+          </m:rPr>
+          <m:t>=</m:t>
+        </m:r>
+        <m:r>
+          <m:rPr>
+            <m:sty m:val="p"/>
+          </m:rPr>
+          <m:t>{</m:t>
+        </m:r>
+        <m:r>
+          <m:t>κ</m:t>
+        </m:r>
+        <m:r>
+          <m:rPr>
+            <m:sty m:val="p"/>
+          </m:rPr>
+          <m:t>&gt;</m:t>
+        </m:r>
+        <m:r>
+          <m:t>0</m:t>
         </m:r>
         <m:r>
           <m:rPr>
@@ -12663,25 +13123,47 @@
           <m:t>,</m:t>
         </m:r>
         <m:r>
-          <m:t>c</m:t>
-        </m:r>
-        <m:r>
-          <m:rPr>
-            <m:sty m:val="p"/>
-          </m:rPr>
-          <m:t>)</m:t>
-        </m:r>
-      </m:oMath>
-      <w:r>
-        <w:rPr>
-          <w:rFonts w:hint="eastAsia"/>
-        </w:rPr>
-        <w:t xml:space="preserve">，情形</w:t>
-      </w:r>
-      <w:r>
-        <w:t xml:space="preserve"> </w:t>
-      </w:r>
-      <m:oMath>
+          <m:t> </m:t>
+        </m:r>
+        <m:r>
+          <m:rPr>
+            <m:nor/>
+            <m:sty m:val="p"/>
+          </m:rPr>
+          <m:t>少數方正確</m:t>
+        </m:r>
+        <m:r>
+          <m:rPr>
+            <m:sty m:val="p"/>
+          </m:rPr>
+          <m:t>}</m:t>
+        </m:r>
+      </m:oMath>
+      <w:r>
+        <w:rPr>
+          <w:rFonts w:hint="eastAsia"/>
+        </w:rPr>
+        <w:t xml:space="preserve">，</w:t>
+      </w:r>
+      <m:oMath>
+        <m:sSub>
+          <m:e>
+            <m:r>
+              <m:t>w</m:t>
+            </m:r>
+          </m:e>
+          <m:sub>
+            <m:r>
+              <m:t>2</m:t>
+            </m:r>
+          </m:sub>
+        </m:sSub>
+        <m:r>
+          <m:rPr>
+            <m:sty m:val="p"/>
+          </m:rPr>
+          <m:t>=</m:t>
+        </m:r>
         <m:r>
           <m:rPr>
             <m:sty m:val="p"/>
@@ -12695,7 +13177,7 @@
           <m:rPr>
             <m:sty m:val="p"/>
           </m:rPr>
-          <m:t>&gt;</m:t>
+          <m:t>&lt;</m:t>
         </m:r>
         <m:r>
           <m:t>0</m:t>
@@ -12714,7 +13196,7 @@
             <m:nor/>
             <m:sty m:val="p"/>
           </m:rPr>
-          <m:t>少數方正確</m:t>
+          <m:t>多數方正確</m:t>
         </m:r>
         <m:r>
           <m:rPr>
@@ -12724,87 +13206,10 @@
         </m:r>
       </m:oMath>
       <w:r>
-        <w:t xml:space="preserve"> </w:t>
-      </w:r>
-      <w:r>
-        <w:rPr>
-          <w:rFonts w:hint="eastAsia"/>
-        </w:rPr>
-        <w:t xml:space="preserve">與</w:t>
-      </w:r>
-      <w:r>
-        <w:t xml:space="preserve"> </w:t>
-      </w:r>
-      <m:oMath>
-        <m:r>
-          <m:rPr>
-            <m:sty m:val="p"/>
-          </m:rPr>
-          <m:t>{</m:t>
-        </m:r>
-        <m:r>
-          <m:t>κ</m:t>
-        </m:r>
-        <m:r>
-          <m:rPr>
-            <m:sty m:val="p"/>
-          </m:rPr>
-          <m:t>&lt;</m:t>
-        </m:r>
-        <m:r>
-          <m:t>0</m:t>
-        </m:r>
-        <m:r>
-          <m:rPr>
-            <m:sty m:val="p"/>
-          </m:rPr>
-          <m:t>,</m:t>
-        </m:r>
-        <m:r>
-          <m:t> </m:t>
-        </m:r>
-        <m:r>
-          <m:rPr>
-            <m:nor/>
-            <m:sty m:val="p"/>
-          </m:rPr>
-          <m:t>多數方正確</m:t>
-        </m:r>
-        <m:r>
-          <m:rPr>
-            <m:sty m:val="p"/>
-          </m:rPr>
-          <m:t>}</m:t>
-        </m:r>
-      </m:oMath>
-      <w:r>
-        <w:t xml:space="preserve"> </w:t>
-      </w:r>
-      <w:r>
-        <w:rPr>
-          <w:rFonts w:hint="eastAsia"/>
-        </w:rPr>
-        <w:t xml:space="preserve">產生相同的可觀測分布；構造上，對兩種真值計算的</w:t>
-      </w:r>
-      <w:r>
-        <w:t xml:space="preserve"> </w:t>
-      </w:r>
-      <m:oMath>
-        <m:r>
-          <m:t>D</m:t>
-        </m:r>
-      </m:oMath>
-      <w:r>
-        <w:t xml:space="preserve"> </w:t>
-      </w:r>
-      <w:r>
-        <w:rPr>
-          <w:rFonts w:hint="eastAsia"/>
-        </w:rPr>
-        <w:t xml:space="preserve">滿足</w:t>
-      </w:r>
-      <w:r>
-        <w:t xml:space="preserve"> </w:t>
+        <w:rPr>
+          <w:rFonts w:hint="eastAsia"/>
+        </w:rPr>
+        <w:t xml:space="preserve">。分別依兩種真值計算時，</w:t>
       </w:r>
       <m:oMath>
         <m:sSup>
@@ -12866,7 +13271,114 @@
         <w:rPr>
           <w:rFonts w:hint="eastAsia"/>
         </w:rPr>
-        <w:t xml:space="preserve">，無標籤方法無法區分二者。此條件不可省略：一旦池內出現第三個有實質人數的答案叢集，兩個世界即可分離（測試中</w:t>
+        <w:t xml:space="preserve">，因此</w:t>
+      </w:r>
+      <w:r>
+        <w:t xml:space="preserve"> TACT </w:t>
+      </w:r>
+      <w:r>
+        <w:rPr>
+          <w:rFonts w:hint="eastAsia"/>
+        </w:rPr>
+        <w:t xml:space="preserve">使用的統計量無法排序這兩個世界。</w:t>
+      </w:r>
+      <w:r>
+        <w:rPr>
+          <w:rFonts w:hint="eastAsia"/>
+          <w:b/>
+          <w:bCs/>
+        </w:rPr>
+        <w:t xml:space="preserve">當題目恰有兩個答案叢集時</w:t>
+      </w:r>
+      <w:r>
+        <w:rPr>
+          <w:rFonts w:hint="eastAsia"/>
+        </w:rPr>
+        <w:t xml:space="preserve">，兩者的</w:t>
+      </w:r>
+      <w:r>
+        <w:t xml:space="preserve"> </w:t>
+      </w:r>
+      <m:oMath>
+        <m:r>
+          <m:rPr>
+            <m:sty m:val="p"/>
+          </m:rPr>
+          <m:t>(</m:t>
+        </m:r>
+        <m:r>
+          <m:t>a</m:t>
+        </m:r>
+        <m:r>
+          <m:rPr>
+            <m:sty m:val="p"/>
+          </m:rPr>
+          <m:t>,</m:t>
+        </m:r>
+        <m:r>
+          <m:t>c</m:t>
+        </m:r>
+        <m:r>
+          <m:rPr>
+            <m:sty m:val="p"/>
+          </m:rPr>
+          <m:t>)</m:t>
+        </m:r>
+      </m:oMath>
+      <w:r>
+        <w:t xml:space="preserve"> </w:t>
+      </w:r>
+      <w:r>
+        <w:rPr>
+          <w:rFonts w:hint="eastAsia"/>
+        </w:rPr>
+        <w:t xml:space="preserve">分布完全相同，任何無標籤方法都無法區分。若有三個以上且各自有實質人數的叢集，兩個分布便不再相同：</w:t>
+      </w:r>
+      <m:oMath>
+        <m:sSub>
+          <m:e>
+            <m:r>
+              <m:t>w</m:t>
+            </m:r>
+          </m:e>
+          <m:sub>
+            <m:r>
+              <m:t>1</m:t>
+            </m:r>
+          </m:sub>
+        </m:sSub>
+      </m:oMath>
+      <w:r>
+        <w:t xml:space="preserve"> </w:t>
+      </w:r>
+      <w:r>
+        <w:rPr>
+          <w:rFonts w:hint="eastAsia"/>
+        </w:rPr>
+        <w:t xml:space="preserve">只有正確的少數叢集帶高信心，</w:t>
+      </w:r>
+      <m:oMath>
+        <m:sSub>
+          <m:e>
+            <m:r>
+              <m:t>w</m:t>
+            </m:r>
+          </m:e>
+          <m:sub>
+            <m:r>
+              <m:t>2</m:t>
+            </m:r>
+          </m:sub>
+        </m:sSub>
+      </m:oMath>
+      <w:r>
+        <w:t xml:space="preserve"> </w:t>
+      </w:r>
+      <w:r>
+        <w:rPr>
+          <w:rFonts w:hint="eastAsia"/>
+        </w:rPr>
+        <w:t xml:space="preserve">則是每個非多數叢集都帶高信心；前兩個叢集上的分布相同，第三叢集的條件信心分布則能將兩者分開，數值驗證為</w:t>
       </w:r>
       <w:r>
         <w:t xml:space="preserve"> </w:t>
@@ -12884,20 +13396,9 @@
           </m:rPr>
           <m:t>S</m:t>
         </m:r>
-      </m:oMath>
-      <w:r>
-        <w:t xml:space="preserve"> </w:t>
-      </w:r>
-      <w:r>
-        <w:rPr>
-          <w:rFonts w:hint="eastAsia"/>
-        </w:rPr>
-        <w:t xml:space="preserve">檢定</w:t>
-      </w:r>
-      <w:r>
-        <w:t xml:space="preserve"> </w:t>
-      </w:r>
-      <m:oMath>
+        <m:r>
+          <m:t> </m:t>
+        </m:r>
         <m:r>
           <m:t>p</m:t>
         </m:r>
@@ -12921,7 +13422,7 @@
               <m:t>−</m:t>
             </m:r>
             <m:r>
-              <m:t>10</m:t>
+              <m:t>15</m:t>
             </m:r>
           </m:sup>
         </m:sSup>
@@ -12930,7 +13431,7 @@
         <w:rPr>
           <w:rFonts w:hint="eastAsia"/>
         </w:rPr>
-        <w:t xml:space="preserve">）。命題的兩個方向都由測試釘住。實務上這個逃逸口多半用不上——自信回音格中</w:t>
+        <w:t xml:space="preserve">。所以不可能性只在池實質為二元時成立。自信回音格中有</w:t>
       </w:r>
       <w:r>
         <w:t xml:space="preserve"> </w:t>
@@ -12953,7 +13454,42 @@
         <w:rPr>
           <w:rFonts w:hint="eastAsia"/>
         </w:rPr>
-        <w:t xml:space="preserve">的題目實質為二元。</w:t>
+        <w:t xml:space="preserve">的題目在</w:t>
+      </w:r>
+      <w:r>
+        <w:t xml:space="preserve"> </w:t>
+      </w:r>
+      <m:oMath>
+        <m:r>
+          <m:t>K</m:t>
+        </m:r>
+        <m:r>
+          <m:rPr>
+            <m:sty m:val="p"/>
+          </m:rPr>
+          <m:t>=</m:t>
+        </m:r>
+        <m:r>
+          <m:t>15</m:t>
+        </m:r>
+      </m:oMath>
+      <w:r>
+        <w:t xml:space="preserve"> </w:t>
+      </w:r>
+      <w:r>
+        <w:rPr>
+          <w:rFonts w:hint="eastAsia"/>
+        </w:rPr>
+        <w:t xml:space="preserve">下沒有第三個叢集，正落在這個範圍內；TACT</w:t>
+      </w:r>
+      <w:r>
+        <w:t xml:space="preserve"> </w:t>
+      </w:r>
+      <w:r>
+        <w:rPr>
+          <w:rFonts w:hint="eastAsia"/>
+        </w:rPr>
+        <w:t xml:space="preserve">與現有已發表方法都沒有利用剩下的訊號，這仍是開放問題。</w:t>
       </w:r>
     </w:p>
     <w:p>
@@ -13073,22 +13609,22 @@
         <w:t xml:space="preserve">題）的群組退回全域估計。由命題</w:t>
       </w:r>
       <w:r>
-        <w:t xml:space="preserve"> 5 </w:t>
-      </w:r>
-      <w:r>
-        <w:rPr>
-          <w:rFonts w:hint="eastAsia"/>
-        </w:rPr>
-        <w:t xml:space="preserve">至</w:t>
-      </w:r>
-      <w:r>
-        <w:t xml:space="preserve"> 7 </w:t>
-      </w:r>
-      <w:r>
-        <w:rPr>
-          <w:rFonts w:hint="eastAsia"/>
-        </w:rPr>
-        <w:t xml:space="preserve">可知，此退回並非便宜行事，而是唯一站得住腳的預設。</w:t>
+        <w:t xml:space="preserve"> </w:t>
+      </w:r>
+      <w:r>
+        <w:rPr>
+          <w:rFonts w:hint="eastAsia"/>
+        </w:rPr>
+        <w:t xml:space="preserve">5、命題</w:t>
+      </w:r>
+      <w:r>
+        <w:t xml:space="preserve"> 6 </w:t>
+      </w:r>
+      <w:r>
+        <w:rPr>
+          <w:rFonts w:hint="eastAsia"/>
+        </w:rPr>
+        <w:t xml:space="preserve">與贏家詛咒的量測可知，此退回並非便宜行事，而是唯一站得住腳的預設。</w:t>
       </w:r>
     </w:p>
     <w:bookmarkEnd w:id="29"/>
@@ -14035,7 +14571,158 @@
     </w:p>
     <w:p>
       <w:pPr>
-        <w:pStyle w:val="BodyText"/>
+        <w:pStyle w:val="CaptionedFigure"/>
+      </w:pPr>
+      <w:r>
+        <w:drawing>
+          <wp:inline>
+            <wp:extent cx="3332174" cy="2575903"/>
+            <wp:effectExtent b="0" l="0" r="0" t="0"/>
+            <wp:docPr descr="圖 2：信心使用效率上的主要結果。TACT-dev 與無標籤的 TACT-LF 全程貼近帶符號最佳值；CISC-devT 與 ECE 閘門在 \kappa&lt;0 的整個區間停留在 SC 基準線。" title="" id="32" name="Picture"/>
+            <a:graphic>
+              <a:graphicData uri="http://schemas.openxmlformats.org/drawingml/2006/picture">
+                <pic:pic>
+                  <pic:nvPicPr>
+                    <pic:cNvPr descr="figs/tact_sweep.png" id="33" name="Picture"/>
+                    <pic:cNvPicPr>
+                      <a:picLocks noChangeArrowheads="1" noChangeAspect="1"/>
+                    </pic:cNvPicPr>
+                  </pic:nvPicPr>
+                  <pic:blipFill>
+                    <a:blip r:embed="rId31"/>
+                    <a:stretch>
+                      <a:fillRect/>
+                    </a:stretch>
+                  </pic:blipFill>
+                  <pic:spPr bwMode="auto">
+                    <a:xfrm>
+                      <a:off x="0" y="0"/>
+                      <a:ext cx="3332174" cy="2575903"/>
+                    </a:xfrm>
+                    <a:prstGeom prst="rect">
+                      <a:avLst/>
+                    </a:prstGeom>
+                    <a:noFill/>
+                    <a:ln w="9525">
+                      <a:noFill/>
+                      <a:headEnd/>
+                      <a:tailEnd/>
+                    </a:ln>
+                  </pic:spPr>
+                </pic:pic>
+              </a:graphicData>
+            </a:graphic>
+          </wp:inline>
+        </w:drawing>
+      </w:r>
+    </w:p>
+    <w:p>
+      <w:pPr>
+        <w:pStyle w:val="ImageCaption"/>
+      </w:pPr>
+      <w:r>
+        <w:rPr>
+          <w:rFonts w:hint="eastAsia"/>
+        </w:rPr>
+        <w:t xml:space="preserve">圖</w:t>
+      </w:r>
+      <w:r>
+        <w:t xml:space="preserve"> </w:t>
+      </w:r>
+      <w:r>
+        <w:rPr>
+          <w:rFonts w:hint="eastAsia"/>
+        </w:rPr>
+        <w:t xml:space="preserve">2：信心使用效率上的主要結果。TACT-dev</w:t>
+      </w:r>
+      <w:r>
+        <w:t xml:space="preserve"> </w:t>
+      </w:r>
+      <w:r>
+        <w:rPr>
+          <w:rFonts w:hint="eastAsia"/>
+        </w:rPr>
+        <w:t xml:space="preserve">與無標籤的</w:t>
+      </w:r>
+      <w:r>
+        <w:t xml:space="preserve"> TACT-LF </w:t>
+      </w:r>
+      <w:r>
+        <w:rPr>
+          <w:rFonts w:hint="eastAsia"/>
+        </w:rPr>
+        <w:t xml:space="preserve">全程貼近帶符號最佳值；CISC-devT</w:t>
+      </w:r>
+      <w:r>
+        <w:t xml:space="preserve"> </w:t>
+      </w:r>
+      <w:r>
+        <w:rPr>
+          <w:rFonts w:hint="eastAsia"/>
+        </w:rPr>
+        <w:t xml:space="preserve">與</w:t>
+      </w:r>
+      <w:r>
+        <w:t xml:space="preserve"> ECE </w:t>
+      </w:r>
+      <w:r>
+        <w:rPr>
+          <w:rFonts w:hint="eastAsia"/>
+        </w:rPr>
+        <w:t xml:space="preserve">閘門在</w:t>
+      </w:r>
+      <w:r>
+        <w:t xml:space="preserve"> </w:t>
+      </w:r>
+      <m:oMath>
+        <m:r>
+          <m:t>κ</m:t>
+        </m:r>
+        <m:r>
+          <m:rPr>
+            <m:sty m:val="p"/>
+          </m:rPr>
+          <m:t>&lt;</m:t>
+        </m:r>
+        <m:r>
+          <m:t>0</m:t>
+        </m:r>
+      </m:oMath>
+      <w:r>
+        <w:t xml:space="preserve"> </w:t>
+      </w:r>
+      <w:r>
+        <w:rPr>
+          <w:rFonts w:hint="eastAsia"/>
+        </w:rPr>
+        <w:t xml:space="preserve">的整個區間停留在</w:t>
+      </w:r>
+      <w:r>
+        <w:t xml:space="preserve"> SC </w:t>
+      </w:r>
+      <w:r>
+        <w:rPr>
+          <w:rFonts w:hint="eastAsia"/>
+        </w:rPr>
+        <w:t xml:space="preserve">基準線。</w:t>
+      </w:r>
+    </w:p>
+    <w:bookmarkEnd w:id="34"/>
+    <w:bookmarkStart w:id="51" w:name="八結果"/>
+    <w:p>
+      <w:pPr>
+        <w:pStyle w:val="Heading2"/>
+      </w:pPr>
+      <w:r>
+        <w:rPr>
+          <w:rFonts w:hint="eastAsia"/>
+        </w:rPr>
+        <w:t xml:space="preserve">八、結果</w:t>
+      </w:r>
+    </w:p>
+    <w:p>
+      <w:pPr>
+        <w:pStyle w:val="FirstParagraph"/>
       </w:pPr>
       <w:r>
         <w:rPr>
@@ -15258,157 +15945,6 @@
         </w:tc>
       </w:tr>
     </w:tbl>
-    <w:p>
-      <w:pPr>
-        <w:pStyle w:val="CaptionedFigure"/>
-      </w:pPr>
-      <w:r>
-        <w:drawing>
-          <wp:inline>
-            <wp:extent cx="3332174" cy="2575903"/>
-            <wp:effectExtent b="0" l="0" r="0" t="0"/>
-            <wp:docPr descr="圖 2：信心使用效率上的主要結果。TACT-dev 與無標籤的 TACT-LF 全程貼近帶符號最佳值；CISC-devT 與 ECE 閘門在 \kappa&lt;0 的整個區間停留在 SC 基準線。" title="" id="32" name="Picture"/>
-            <a:graphic>
-              <a:graphicData uri="http://schemas.openxmlformats.org/drawingml/2006/picture">
-                <pic:pic>
-                  <pic:nvPicPr>
-                    <pic:cNvPr descr="figs/tact_sweep.png" id="33" name="Picture"/>
-                    <pic:cNvPicPr>
-                      <a:picLocks noChangeArrowheads="1" noChangeAspect="1"/>
-                    </pic:cNvPicPr>
-                  </pic:nvPicPr>
-                  <pic:blipFill>
-                    <a:blip r:embed="rId31"/>
-                    <a:stretch>
-                      <a:fillRect/>
-                    </a:stretch>
-                  </pic:blipFill>
-                  <pic:spPr bwMode="auto">
-                    <a:xfrm>
-                      <a:off x="0" y="0"/>
-                      <a:ext cx="3332174" cy="2575903"/>
-                    </a:xfrm>
-                    <a:prstGeom prst="rect">
-                      <a:avLst/>
-                    </a:prstGeom>
-                    <a:noFill/>
-                    <a:ln w="9525">
-                      <a:noFill/>
-                      <a:headEnd/>
-                      <a:tailEnd/>
-                    </a:ln>
-                  </pic:spPr>
-                </pic:pic>
-              </a:graphicData>
-            </a:graphic>
-          </wp:inline>
-        </w:drawing>
-      </w:r>
-    </w:p>
-    <w:p>
-      <w:pPr>
-        <w:pStyle w:val="ImageCaption"/>
-      </w:pPr>
-      <w:r>
-        <w:rPr>
-          <w:rFonts w:hint="eastAsia"/>
-        </w:rPr>
-        <w:t xml:space="preserve">圖</w:t>
-      </w:r>
-      <w:r>
-        <w:t xml:space="preserve"> </w:t>
-      </w:r>
-      <w:r>
-        <w:rPr>
-          <w:rFonts w:hint="eastAsia"/>
-        </w:rPr>
-        <w:t xml:space="preserve">2：信心使用效率上的主要結果。TACT-dev</w:t>
-      </w:r>
-      <w:r>
-        <w:t xml:space="preserve"> </w:t>
-      </w:r>
-      <w:r>
-        <w:rPr>
-          <w:rFonts w:hint="eastAsia"/>
-        </w:rPr>
-        <w:t xml:space="preserve">與無標籤的</w:t>
-      </w:r>
-      <w:r>
-        <w:t xml:space="preserve"> TACT-LF </w:t>
-      </w:r>
-      <w:r>
-        <w:rPr>
-          <w:rFonts w:hint="eastAsia"/>
-        </w:rPr>
-        <w:t xml:space="preserve">全程貼近帶符號最佳值；CISC-devT</w:t>
-      </w:r>
-      <w:r>
-        <w:t xml:space="preserve"> </w:t>
-      </w:r>
-      <w:r>
-        <w:rPr>
-          <w:rFonts w:hint="eastAsia"/>
-        </w:rPr>
-        <w:t xml:space="preserve">與</w:t>
-      </w:r>
-      <w:r>
-        <w:t xml:space="preserve"> ECE </w:t>
-      </w:r>
-      <w:r>
-        <w:rPr>
-          <w:rFonts w:hint="eastAsia"/>
-        </w:rPr>
-        <w:t xml:space="preserve">閘門在</w:t>
-      </w:r>
-      <w:r>
-        <w:t xml:space="preserve"> </w:t>
-      </w:r>
-      <m:oMath>
-        <m:r>
-          <m:t>κ</m:t>
-        </m:r>
-        <m:r>
-          <m:rPr>
-            <m:sty m:val="p"/>
-          </m:rPr>
-          <m:t>&lt;</m:t>
-        </m:r>
-        <m:r>
-          <m:t>0</m:t>
-        </m:r>
-      </m:oMath>
-      <w:r>
-        <w:t xml:space="preserve"> </w:t>
-      </w:r>
-      <w:r>
-        <w:rPr>
-          <w:rFonts w:hint="eastAsia"/>
-        </w:rPr>
-        <w:t xml:space="preserve">的整個區間停留在</w:t>
-      </w:r>
-      <w:r>
-        <w:t xml:space="preserve"> SC </w:t>
-      </w:r>
-      <w:r>
-        <w:rPr>
-          <w:rFonts w:hint="eastAsia"/>
-        </w:rPr>
-        <w:t xml:space="preserve">基準線。</w:t>
-      </w:r>
-    </w:p>
-    <w:bookmarkEnd w:id="34"/>
-    <w:bookmarkStart w:id="51" w:name="八結果"/>
-    <w:p>
-      <w:pPr>
-        <w:pStyle w:val="Heading2"/>
-      </w:pPr>
-      <w:r>
-        <w:rPr>
-          <w:rFonts w:hint="eastAsia"/>
-        </w:rPr>
-        <w:t xml:space="preserve">八、結果</w:t>
-      </w:r>
-    </w:p>
     <w:bookmarkStart w:id="35" w:name="帶符號恢復有標籤與無標籤"/>
     <w:p>
       <w:pPr>
@@ -17103,7 +17639,7 @@
         <w:t xml:space="preserve">倍；無標籤情形下重複塌縮警報觸發，方法拒絕行動。由命題</w:t>
       </w:r>
       <w:r>
-        <w:t xml:space="preserve"> 7 </w:t>
+        <w:t xml:space="preserve"> 6 </w:t>
       </w:r>
       <w:r>
         <w:rPr>
@@ -17545,22 +18081,22 @@
         <w:t xml:space="preserve">：它無法勝過它自己所導出的那個多數決。這個對照正是命題</w:t>
       </w:r>
       <w:r>
-        <w:t xml:space="preserve"> 5 </w:t>
-      </w:r>
-      <w:r>
-        <w:rPr>
-          <w:rFonts w:hint="eastAsia"/>
-        </w:rPr>
-        <w:t xml:space="preserve">至</w:t>
-      </w:r>
-      <w:r>
-        <w:t xml:space="preserve"> 7 </w:t>
-      </w:r>
-      <w:r>
-        <w:rPr>
-          <w:rFonts w:hint="eastAsia"/>
-        </w:rPr>
-        <w:t xml:space="preserve">的實證呈現，而它現形的地方是群組格——即使拿到逐群組估計器所利用的同一個協變量，它也只到</w:t>
+        <w:t xml:space="preserve"> </w:t>
+      </w:r>
+      <w:r>
+        <w:rPr>
+          <w:rFonts w:hint="eastAsia"/>
+        </w:rPr>
+        <w:t xml:space="preserve">5、命題</w:t>
+      </w:r>
+      <w:r>
+        <w:t xml:space="preserve"> 6 </w:t>
+      </w:r>
+      <w:r>
+        <w:rPr>
+          <w:rFonts w:hint="eastAsia"/>
+        </w:rPr>
+        <w:t xml:space="preserve">與贏家詛咒量測的實證呈現，而它現形的地方是群組格——即使拿到逐群組估計器所利用的同一個協變量，它也只到</w:t>
       </w:r>
       <w:r>
         <w:t xml:space="preserve"> </w:t>
@@ -18844,7 +19380,7 @@
         <w:rPr>
           <w:rFonts w:hint="eastAsia"/>
         </w:rPr>
-        <w:t xml:space="preserve">本文第四至六節的每一項主張都是數學性質而非經驗趨勢，因此公開程式碼為每一項配置可執行的測試；測試套件共</w:t>
+        <w:t xml:space="preserve">本文第四至六節的每一項主張都是數學性質而非經驗趨勢，因此公開程式碼為每一項設定可執行的測試；測試套件共</w:t>
       </w:r>
       <w:r>
         <w:t xml:space="preserve"> 102 </w:t>
@@ -18863,6 +19399,34 @@
           <w:rFonts w:hint="eastAsia"/>
         </w:rPr>
         <w:t xml:space="preserve">與後續工作。下表列出命題與測試的對應——若性質不再成立，對應測試即失敗。</w:t>
+      </w:r>
+    </w:p>
+    <w:p>
+      <w:pPr>
+        <w:pStyle w:val="BodyText"/>
+      </w:pPr>
+      <w:r>
+        <w:rPr>
+          <w:rFonts w:hint="eastAsia"/>
+          <w:b/>
+          <w:bCs/>
+        </w:rPr>
+        <w:t xml:space="preserve">表</w:t>
+      </w:r>
+      <w:r>
+        <w:rPr>
+          <w:b/>
+          <w:bCs/>
+        </w:rPr>
+        <w:t xml:space="preserve"> </w:t>
+      </w:r>
+      <w:r>
+        <w:rPr>
+          <w:rFonts w:hint="eastAsia"/>
+          <w:b/>
+          <w:bCs/>
+        </w:rPr>
+        <w:t xml:space="preserve">4：測試套件驗證的內容。本文每一項命題都有可執行的對應測試；反向測試會刻意讓已否決方案失敗，避免日後的迴歸錯誤悄悄將它們恢復。</w:t>
       </w:r>
     </w:p>
     <w:tbl>
@@ -19137,7 +19701,22 @@
               <w:t xml:space="preserve">命題</w:t>
             </w:r>
             <w:r>
-              <w:t xml:space="preserve"> 5–7</w:t>
+              <w:t xml:space="preserve"> </w:t>
+            </w:r>
+            <w:r>
+              <w:rPr>
+                <w:rFonts w:hint="eastAsia"/>
+              </w:rPr>
+              <w:t xml:space="preserve">5、命題</w:t>
+            </w:r>
+            <w:r>
+              <w:t xml:space="preserve"> 6 </w:t>
+            </w:r>
+            <w:r>
+              <w:rPr>
+                <w:rFonts w:hint="eastAsia"/>
+              </w:rPr>
+              <w:t xml:space="preserve">與贏家詛咒量測</w:t>
             </w:r>
           </w:p>
         </w:tc>
@@ -23504,7 +24083,7 @@
           <w:b/>
           <w:bCs/>
         </w:rPr>
-        <w:t xml:space="preserve">4：確認實驗，MATH</w:t>
+        <w:t xml:space="preserve">5：確認實驗，MATH</w:t>
       </w:r>
       <w:r>
         <w:rPr>
@@ -24006,7 +24585,7 @@
         <w:rPr>
           <w:rFonts w:hint="eastAsia"/>
         </w:rPr>
-        <w:t xml:space="preserve">5）。程式碼生成這一側有可執行測試提供逐樣本真值，照理窗口該更寬：40</w:t>
+        <w:t xml:space="preserve">6）。程式碼生成這一側有可執行測試提供逐樣本真值，照理窗口該更寬：40</w:t>
       </w:r>
       <w:r>
         <w:t xml:space="preserve"> </w:t>
@@ -24313,7 +24892,7 @@
           <w:b/>
           <w:bCs/>
         </w:rPr>
-        <w:t xml:space="preserve">5：跨基質的可作用分層，全表採同一組定義：</w:t>
+        <w:t xml:space="preserve">6：跨基質的可作用分層，全表採同一組定義：</w:t>
       </w:r>
       <w:r>
         <w:rPr>
@@ -25798,7 +26377,7 @@
         <w:rPr>
           <w:rFonts w:hint="eastAsia"/>
         </w:rPr>
-        <w:t xml:space="preserve">題，信心加權能碰到的不到其中一半，而且沒有任何一種可達配置達到顯著。</w:t>
+        <w:t xml:space="preserve">題，信心加權能碰到的不到其中一半，而且沒有任何一種可達設定達到顯著。</w:t>
       </w:r>
     </w:p>
     <w:bookmarkEnd w:id="50"/>
@@ -26131,7 +26710,7 @@
         <w:rPr>
           <w:rFonts w:hint="eastAsia"/>
         </w:rPr>
-        <w:t xml:space="preserve">7）。後續工作實測了越過該邊界的後果，情況比「低估信任」嚴重得多：在</w:t>
+        <w:t xml:space="preserve">6）。後續工作實測了越過該邊界的後果，情況比「低估信任」嚴重得多：在</w:t>
       </w:r>
       <w:r>
         <w:rPr>
@@ -26368,22 +26947,22 @@
         <w:t xml:space="preserve">僅輸出一個指數；由命題</w:t>
       </w:r>
       <w:r>
-        <w:t xml:space="preserve"> 5 </w:t>
-      </w:r>
-      <w:r>
-        <w:rPr>
-          <w:rFonts w:hint="eastAsia"/>
-        </w:rPr>
-        <w:t xml:space="preserve">至</w:t>
-      </w:r>
-      <w:r>
-        <w:t xml:space="preserve"> </w:t>
-      </w:r>
-      <w:r>
-        <w:rPr>
-          <w:rFonts w:hint="eastAsia"/>
-        </w:rPr>
-        <w:t xml:space="preserve">7，群組內的逐題變異在缺乏進一步協變量時無法利用。</w:t>
+        <w:t xml:space="preserve"> </w:t>
+      </w:r>
+      <w:r>
+        <w:rPr>
+          <w:rFonts w:hint="eastAsia"/>
+        </w:rPr>
+        <w:t xml:space="preserve">5、命題</w:t>
+      </w:r>
+      <w:r>
+        <w:t xml:space="preserve"> 6 </w:t>
+      </w:r>
+      <w:r>
+        <w:rPr>
+          <w:rFonts w:hint="eastAsia"/>
+        </w:rPr>
+        <w:t xml:space="preserve">與贏家詛咒量測，群組內的逐題變異在缺乏進一步協變量時無法利用。</w:t>
       </w:r>
     </w:p>
     <w:p>
@@ -26396,7 +26975,7 @@
           <w:b/>
           <w:bCs/>
         </w:rPr>
-        <w:t xml:space="preserve">薄窗。</w:t>
+        <w:t xml:space="preserve">薄窗現象。</w:t>
       </w:r>
       <w:r>
         <w:t xml:space="preserve"> </w:t>
@@ -26439,7 +27018,7 @@
         <w:t xml:space="preserve">，跨兩個領域，而且題目變難時不會變寬：它們從飽和直接進入能力受限。對本文的方法有兩個推論。其一，棄權不是保守的折衷而是唯一正確的預設，硬要動手的實測代價在兩個真實基質上都是負的（表</w:t>
       </w:r>
       <w:r>
-        <w:t xml:space="preserve"> 4 </w:t>
+        <w:t xml:space="preserve"> 5 </w:t>
       </w:r>
       <w:r>
         <w:rPr>
@@ -26932,10 +27511,97 @@
         <w:rPr>
           <w:rFonts w:hint="eastAsia"/>
         </w:rPr>
-        <w:t xml:space="preserve">。每支腳本都會寫出其對應表格所引用的</w:t>
-      </w:r>
-      <w:r>
-        <w:t xml:space="preserve"> artifact。</w:t>
+        <w:t xml:space="preserve">；發現（e）的三組棄權重放由</w:t>
+      </w:r>
+      <w:r>
+        <w:t xml:space="preserve"> </w:t>
+      </w:r>
+      <w:r>
+        <w:rPr>
+          <w:rStyle w:val="VerbatimChar"/>
+        </w:rPr>
+        <w:t xml:space="preserve">run_abstention_identifiability.py</w:t>
+      </w:r>
+      <w:r>
+        <w:t xml:space="preserve"> </w:t>
+      </w:r>
+      <w:r>
+        <w:rPr>
+          <w:rFonts w:hint="eastAsia"/>
+        </w:rPr>
+        <w:t xml:space="preserve">產生，發現（f）的植入通道操作特性則由</w:t>
+      </w:r>
+      <w:r>
+        <w:t xml:space="preserve"> </w:t>
+      </w:r>
+      <w:r>
+        <w:rPr>
+          <w:rStyle w:val="VerbatimChar"/>
+        </w:rPr>
+        <w:t xml:space="preserve">run_planted_sensitivity.py</w:t>
+      </w:r>
+      <w:r>
+        <w:t xml:space="preserve"> </w:t>
+      </w:r>
+      <w:r>
+        <w:rPr>
+          <w:rFonts w:hint="eastAsia"/>
+        </w:rPr>
+        <w:t xml:space="preserve">產生。每支腳本都會寫出其對應表格所引用的</w:t>
+      </w:r>
+      <w:r>
+        <w:t xml:space="preserve"> </w:t>
+      </w:r>
+      <w:r>
+        <w:rPr>
+          <w:rFonts w:hint="eastAsia"/>
+        </w:rPr>
+        <w:t xml:space="preserve">artifact。圖</w:t>
+      </w:r>
+      <w:r>
+        <w:t xml:space="preserve"> 1 </w:t>
+      </w:r>
+      <w:r>
+        <w:rPr>
+          <w:rFonts w:hint="eastAsia"/>
+        </w:rPr>
+        <w:t xml:space="preserve">至圖</w:t>
+      </w:r>
+      <w:r>
+        <w:t xml:space="preserve"> 4 </w:t>
+      </w:r>
+      <w:r>
+        <w:rPr>
+          <w:rFonts w:hint="eastAsia"/>
+        </w:rPr>
+        <w:t xml:space="preserve">是</w:t>
+      </w:r>
+      <w:r>
+        <w:t xml:space="preserve"> </w:t>
+      </w:r>
+      <w:r>
+        <w:rPr>
+          <w:rStyle w:val="VerbatimChar"/>
+        </w:rPr>
+        <w:t xml:space="preserve">experiments/make_paper_figures.py</w:t>
+      </w:r>
+      <w:r>
+        <w:t xml:space="preserve"> </w:t>
+      </w:r>
+      <w:r>
+        <w:rPr>
+          <w:rFonts w:hint="eastAsia"/>
+        </w:rPr>
+        <w:t xml:space="preserve">讀取同一批</w:t>
+      </w:r>
+      <w:r>
+        <w:t xml:space="preserve"> JSON </w:t>
+      </w:r>
+      <w:r>
+        <w:rPr>
+          <w:rFonts w:hint="eastAsia"/>
+        </w:rPr>
+        <w:t xml:space="preserve">後輸出的向量圖。</w:t>
       </w:r>
     </w:p>
     <w:bookmarkEnd w:id="55"/>
@@ -26977,6 +27643,61 @@
           <w:rFonts w:hint="eastAsia"/>
         </w:rPr>
         <w:t xml:space="preserve">的量是逐題的；除非有可用的群組協變量（第六節），估計器只輸出一個全域純量。</w:t>
+      </w:r>
+    </w:p>
+    <w:p>
+      <w:pPr>
+        <w:pStyle w:val="BodyText"/>
+      </w:pPr>
+      <w:r>
+        <w:rPr>
+          <w:rFonts w:hint="eastAsia"/>
+          <w:b/>
+          <w:bCs/>
+        </w:rPr>
+        <w:t xml:space="preserve">表</w:t>
+      </w:r>
+      <w:r>
+        <w:rPr>
+          <w:b/>
+          <w:bCs/>
+        </w:rPr>
+        <w:t xml:space="preserve"> </w:t>
+      </w:r>
+      <w:r>
+        <w:rPr>
+          <w:rFonts w:hint="eastAsia"/>
+          <w:b/>
+          <w:bCs/>
+        </w:rPr>
+        <w:t xml:space="preserve">7：依首次使用順序排列的符號。帶下標</w:t>
+      </w:r>
+      <w:r>
+        <w:rPr>
+          <w:b/>
+          <w:bCs/>
+        </w:rPr>
+        <w:t xml:space="preserve"> </w:t>
+      </w:r>
+      <m:oMath>
+        <m:r>
+          <m:t>q</m:t>
+        </m:r>
+      </m:oMath>
+      <w:r>
+        <w:rPr>
+          <w:b/>
+          <w:bCs/>
+        </w:rPr>
+        <w:t xml:space="preserve"> </w:t>
+      </w:r>
+      <w:r>
+        <w:rPr>
+          <w:rFonts w:hint="eastAsia"/>
+          <w:b/>
+          <w:bCs/>
+        </w:rPr>
+        <w:t xml:space="preserve">的量屬於逐題量；除非有可用的群組協變量（第六節），估計器只輸出一個全域純量。</w:t>
       </w:r>
     </w:p>
     <w:tbl>

</xml_diff>

<commit_message>
Fix Chinese algorithm layout
</commit_message>
<xml_diff>
--- a/paper/tact_zh_complete.docx
+++ b/paper/tact_zh_complete.docx
@@ -2,7 +2,7 @@
 <file path=word/document.xml><?xml version="1.0" encoding="utf-8"?>
 <w:document xmlns:w="http://schemas.openxmlformats.org/wordprocessingml/2006/main" xmlns:m="http://schemas.openxmlformats.org/officeDocument/2006/math" xmlns:r="http://schemas.openxmlformats.org/officeDocument/2006/relationships" xmlns:o="urn:schemas-microsoft-com:office:office" xmlns:v="urn:schemas-microsoft-com:vml" xmlns:w10="urn:schemas-microsoft-com:office:word" xmlns:a="http://schemas.openxmlformats.org/drawingml/2006/main" xmlns:pic="http://schemas.openxmlformats.org/drawingml/2006/picture" xmlns:wp="http://schemas.openxmlformats.org/drawingml/2006/wordprocessingDrawing">
   <w:body>
-    <w:bookmarkStart w:id="112" w:name="tact面向大型語言模型自我一致性投票的信任錨定信心調節"/>
+    <w:bookmarkStart w:id="114" w:name="tact面向大型語言模型自我一致性投票的信任錨定信心調節"/>
     <w:p>
       <w:pPr>
         <w:pStyle w:val="Heading1"/>
@@ -3612,7 +3612,7 @@
     </w:p>
     <w:bookmarkEnd w:id="16"/>
     <w:bookmarkEnd w:id="17"/>
-    <w:bookmarkStart w:id="23" w:name="四tact"/>
+    <w:bookmarkStart w:id="24" w:name="四tact"/>
     <w:p>
       <w:pPr>
         <w:pStyle w:val="Heading2"/>
@@ -8303,52 +8303,40 @@
         <w:t xml:space="preserve">，不是連結函數算出的原始幅度。因此飽和格主要驗證符號是否正確；連結函數的形狀真正承重之處，是尚未碰到截斷的中等耦合區。</w:t>
       </w:r>
     </w:p>
+    <w:bookmarkEnd w:id="21"/>
+    <w:bookmarkStart w:id="22" w:name="alg-tact"/>
     <w:p>
       <w:pPr>
-        <w:pStyle w:val="BodyText"/>
+        <w:pStyle w:val="Heading3"/>
       </w:pPr>
       <w:r>
         <w:rPr>
           <w:rFonts w:hint="eastAsia"/>
-          <w:b/>
-          <w:bCs/>
         </w:rPr>
         <w:t xml:space="preserve">演算法</w:t>
       </w:r>
       <w:r>
-        <w:rPr>
-          <w:b/>
-          <w:bCs/>
-        </w:rPr>
-        <w:t xml:space="preserve"> </w:t>
-      </w:r>
-      <w:r>
-        <w:rPr>
-          <w:rFonts w:hint="eastAsia"/>
-          <w:b/>
-          <w:bCs/>
+        <w:t xml:space="preserve"> </w:t>
+      </w:r>
+      <w:r>
+        <w:rPr>
+          <w:rFonts w:hint="eastAsia"/>
         </w:rPr>
         <w:t xml:space="preserve">1：TACT（有標籤</w:t>
       </w:r>
       <w:r>
-        <w:rPr>
-          <w:b/>
-          <w:bCs/>
-        </w:rPr>
         <w:t xml:space="preserve"> dev </w:t>
       </w:r>
       <w:r>
         <w:rPr>
           <w:rFonts w:hint="eastAsia"/>
-          <w:b/>
-          <w:bCs/>
-        </w:rPr>
-        <w:t xml:space="preserve">路徑）。</w:t>
+        </w:rPr>
+        <w:t xml:space="preserve">路徑）</w:t>
       </w:r>
     </w:p>
     <w:p>
       <w:pPr>
-        <w:pStyle w:val="BodyText"/>
+        <w:pStyle w:val="FirstParagraph"/>
       </w:pPr>
       <w:r>
         <w:rPr>
@@ -11636,8 +11624,8 @@
         <w:t xml:space="preserve">，沒有逐題參數；死區因此代表全域棄權，不是事後挑掉不利題目。</w:t>
       </w:r>
     </w:p>
-    <w:bookmarkEnd w:id="21"/>
-    <w:bookmarkStart w:id="22" w:name="端點性質"/>
+    <w:bookmarkEnd w:id="22"/>
+    <w:bookmarkStart w:id="23" w:name="端點性質"/>
     <w:p>
       <w:pPr>
         <w:pStyle w:val="Heading3"/>
@@ -12456,9 +12444,9 @@
         <w:t xml:space="preserve">恆等式與連結推導亦各有數值測試）。</w:t>
       </w:r>
     </w:p>
-    <w:bookmarkEnd w:id="22"/>
     <w:bookmarkEnd w:id="23"/>
-    <w:bookmarkStart w:id="27" w:name="五無標籤估計"/>
+    <w:bookmarkEnd w:id="24"/>
+    <w:bookmarkStart w:id="29" w:name="五無標籤估計"/>
     <w:p>
       <w:pPr>
         <w:pStyle w:val="Heading2"/>
@@ -12470,7 +12458,7 @@
         <w:t xml:space="preserve">五、無標籤估計</w:t>
       </w:r>
     </w:p>
-    <w:bookmarkStart w:id="24" w:name="管線"/>
+    <w:bookmarkStart w:id="25" w:name="管線"/>
     <w:p>
       <w:pPr>
         <w:pStyle w:val="Heading3"/>
@@ -12783,37 +12771,31 @@
         <w:t xml:space="preserve">。</w:t>
       </w:r>
     </w:p>
+    <w:bookmarkEnd w:id="25"/>
+    <w:bookmarkStart w:id="26" w:name="alg-tact-lf"/>
     <w:p>
       <w:pPr>
-        <w:pStyle w:val="BodyText"/>
+        <w:pStyle w:val="Heading3"/>
       </w:pPr>
       <w:r>
         <w:rPr>
           <w:rFonts w:hint="eastAsia"/>
-          <w:b/>
-          <w:bCs/>
         </w:rPr>
         <w:t xml:space="preserve">演算法</w:t>
       </w:r>
       <w:r>
-        <w:rPr>
-          <w:b/>
-          <w:bCs/>
-        </w:rPr>
-        <w:t xml:space="preserve"> </w:t>
-      </w:r>
-      <w:r>
-        <w:rPr>
-          <w:rFonts w:hint="eastAsia"/>
-          <w:b/>
-          <w:bCs/>
-        </w:rPr>
-        <w:t xml:space="preserve">2：TACT-LF（完全無標籤路徑）。</w:t>
+        <w:t xml:space="preserve"> </w:t>
+      </w:r>
+      <w:r>
+        <w:rPr>
+          <w:rFonts w:hint="eastAsia"/>
+        </w:rPr>
+        <w:t xml:space="preserve">2：TACT-LF（完全無標籤路徑）</w:t>
       </w:r>
     </w:p>
     <w:p>
       <w:pPr>
-        <w:pStyle w:val="BodyText"/>
+        <w:pStyle w:val="FirstParagraph"/>
       </w:pPr>
       <w:r>
         <w:rPr>
@@ -15820,8 +15802,8 @@
         <w:t xml:space="preserve">正是無標籤設定不知道的量；實作將它保持為未設定，而不是以多數比例冒充正確率。</w:t>
       </w:r>
     </w:p>
-    <w:bookmarkEnd w:id="24"/>
-    <w:bookmarkStart w:id="25" w:name="符號一致性及其邊界"/>
+    <w:bookmarkEnd w:id="26"/>
+    <w:bookmarkStart w:id="27" w:name="符號一致性及其邊界"/>
     <w:p>
       <w:pPr>
         <w:pStyle w:val="Heading3"/>
@@ -16212,8 +16194,8 @@
         <w:t xml:space="preserve">中雙根歧義在單通道情形的對應），因此任何無標籤保證必然附帶條件；本文如實陳述此限制。</w:t>
       </w:r>
     </w:p>
-    <w:bookmarkEnd w:id="25"/>
-    <w:bookmarkStart w:id="26" w:name="去衰減與警報"/>
+    <w:bookmarkEnd w:id="27"/>
+    <w:bookmarkStart w:id="28" w:name="去衰減與警報"/>
     <w:p>
       <w:pPr>
         <w:pStyle w:val="Heading3"/>
@@ -16728,9 +16710,9 @@
         <w:t xml:space="preserve">標籤取符號並送入管線，同時僅停用代理符號警報，即可以極低的標註成本規避上述歧義。</w:t>
       </w:r>
     </w:p>
-    <w:bookmarkEnd w:id="26"/>
-    <w:bookmarkEnd w:id="27"/>
-    <w:bookmarkStart w:id="30" w:name="六異質性不可能性與出路"/>
+    <w:bookmarkEnd w:id="28"/>
+    <w:bookmarkEnd w:id="29"/>
+    <w:bookmarkStart w:id="32" w:name="六異質性不可能性與出路"/>
     <w:p>
       <w:pPr>
         <w:pStyle w:val="Heading2"/>
@@ -16742,7 +16724,7 @@
         <w:t xml:space="preserve">六、異質性：不可能性與出路</w:t>
       </w:r>
     </w:p>
-    <w:bookmarkStart w:id="28" w:name="i.i.d.-耦合下逐題自適應不可行"/>
+    <w:bookmarkStart w:id="30" w:name="i.i.d.-耦合下逐題自適應不可行"/>
     <w:p>
       <w:pPr>
         <w:pStyle w:val="Heading3"/>
@@ -17718,8 +17700,8 @@
         <w:t xml:space="preserve">位元層級相同的結果（不一致配對數為零）。</w:t>
       </w:r>
     </w:p>
-    <w:bookmarkEnd w:id="28"/>
-    <w:bookmarkStart w:id="29" w:name="tact-group"/>
+    <w:bookmarkEnd w:id="30"/>
+    <w:bookmarkStart w:id="31" w:name="tact-group"/>
     <w:p>
       <w:pPr>
         <w:pStyle w:val="Heading3"/>
@@ -17801,9 +17783,9 @@
         <w:t xml:space="preserve">與贏家詛咒的量測可知，此退回並非便宜行事，而是唯一站得住腳的預設。</w:t>
       </w:r>
     </w:p>
-    <w:bookmarkEnd w:id="29"/>
-    <w:bookmarkEnd w:id="30"/>
-    <w:bookmarkStart w:id="34" w:name="七實驗設定"/>
+    <w:bookmarkEnd w:id="31"/>
+    <w:bookmarkEnd w:id="32"/>
+    <w:bookmarkStart w:id="36" w:name="七實驗設定"/>
     <w:p>
       <w:pPr>
         <w:pStyle w:val="Heading2"/>
@@ -18752,18 +18734,18 @@
           <wp:inline>
             <wp:extent cx="3332174" cy="2575903"/>
             <wp:effectExtent b="0" l="0" r="0" t="0"/>
-            <wp:docPr descr="圖 2：信心使用效率上的主要結果。TACT-dev 與無標籤的 TACT-LF 全程貼近帶符號最佳值；CISC-devT 與 ECE 閘門在 \kappa&lt;0 的整個區間停留在 SC 基準線。" title="" id="32" name="Picture"/>
+            <wp:docPr descr="圖 2：信心使用效率上的主要結果。TACT-dev 與無標籤的 TACT-LF 全程貼近帶符號最佳值；CISC-devT 與 ECE 閘門在 \kappa&lt;0 的整個區間停留在 SC 基準線。" title="" id="34" name="Picture"/>
             <a:graphic>
               <a:graphicData uri="http://schemas.openxmlformats.org/drawingml/2006/picture">
                 <pic:pic>
                   <pic:nvPicPr>
-                    <pic:cNvPr descr="figs/tact_sweep.png" id="33" name="Picture"/>
+                    <pic:cNvPr descr="figs/tact_sweep.png" id="35" name="Picture"/>
                     <pic:cNvPicPr>
                       <a:picLocks noChangeArrowheads="1" noChangeAspect="1"/>
                     </pic:cNvPicPr>
                   </pic:nvPicPr>
                   <pic:blipFill>
-                    <a:blip r:embed="rId31"/>
+                    <a:blip r:embed="rId33"/>
                     <a:stretch>
                       <a:fillRect/>
                     </a:stretch>
@@ -18881,8 +18863,8 @@
         <w:t xml:space="preserve">基準線。</w:t>
       </w:r>
     </w:p>
-    <w:bookmarkEnd w:id="34"/>
-    <w:bookmarkStart w:id="51" w:name="八結果"/>
+    <w:bookmarkEnd w:id="36"/>
+    <w:bookmarkStart w:id="53" w:name="八結果"/>
     <w:p>
       <w:pPr>
         <w:pStyle w:val="Heading2"/>
@@ -20119,7 +20101,7 @@
         </w:tc>
       </w:tr>
     </w:tbl>
-    <w:bookmarkStart w:id="35" w:name="帶符號恢復有標籤與無標籤"/>
+    <w:bookmarkStart w:id="37" w:name="帶符號恢復有標籤與無標籤"/>
     <w:p>
       <w:pPr>
         <w:pStyle w:val="Heading3"/>
@@ -21598,8 +21580,8 @@
         <w:t xml:space="preserve">條件保證的預期行為。</w:t>
       </w:r>
     </w:p>
-    <w:bookmarkEnd w:id="35"/>
-    <w:bookmarkStart w:id="39" w:name="原始值失效處的排名不變性"/>
+    <w:bookmarkEnd w:id="37"/>
+    <w:bookmarkStart w:id="41" w:name="原始值失效處的排名不變性"/>
     <w:p>
       <w:pPr>
         <w:pStyle w:val="Heading3"/>
@@ -21854,18 +21836,18 @@
           <wp:inline>
             <wp:extent cx="3121335" cy="2479651"/>
             <wp:effectExtent b="0" l="0" r="0" t="0"/>
-            <wp:docPr descr="圖 3：對抗情境。虛線為原始值權重的測試集最佳。左側各組顯示排名不變性在壓縮下勝過整個原始值家族；最右側顯示有標籤變體反制自信回音，無標籤變體則觸發警報並拒絕行動。" title="" id="37" name="Picture"/>
+            <wp:docPr descr="圖 3：對抗情境。虛線為原始值權重的測試集最佳。左側各組顯示排名不變性在壓縮下勝過整個原始值家族；最右側顯示有標籤變體反制自信回音，無標籤變體則觸發警報並拒絕行動。" title="" id="39" name="Picture"/>
             <a:graphic>
               <a:graphicData uri="http://schemas.openxmlformats.org/drawingml/2006/picture">
                 <pic:pic>
                   <pic:nvPicPr>
-                    <pic:cNvPr descr="figs/tact_adversarial.png" id="38" name="Picture"/>
+                    <pic:cNvPr descr="figs/tact_adversarial.png" id="40" name="Picture"/>
                     <pic:cNvPicPr>
                       <a:picLocks noChangeArrowheads="1" noChangeAspect="1"/>
                     </pic:cNvPicPr>
                   </pic:nvPicPr>
                   <pic:blipFill>
-                    <a:blip r:embed="rId36"/>
+                    <a:blip r:embed="rId38"/>
                     <a:stretch>
                       <a:fillRect/>
                     </a:stretch>
@@ -21912,8 +21894,8 @@
         <w:t xml:space="preserve">3：對抗情境。虛線為原始值權重的測試集最佳。左側各組顯示排名不變性在壓縮下勝過整個原始值家族；最右側顯示有標籤變體反制自信回音，無標籤變體則觸發警報並拒絕行動。</w:t>
       </w:r>
     </w:p>
-    <w:bookmarkEnd w:id="39"/>
-    <w:bookmarkStart w:id="43" w:name="異質性"/>
+    <w:bookmarkEnd w:id="41"/>
+    <w:bookmarkStart w:id="45" w:name="異質性"/>
     <w:p>
       <w:pPr>
         <w:pStyle w:val="Heading3"/>
@@ -22889,18 +22871,18 @@
           <wp:inline>
             <wp:extent cx="3121335" cy="3167169"/>
             <wp:effectExtent b="0" l="0" r="0" t="0"/>
-            <wp:docPr descr="圖 4：結構化與 i.i.d. 異質性的對照。左：具可觀測協變量時，逐群組 TACT（無標籤）自 0.785 基準線逼近逐題最佳值，且對 SC 零損失。右：可證明封閉的 i.i.d. 情境，所有方法停留在基準線，含陰性對照在內。" title="" id="41" name="Picture"/>
+            <wp:docPr descr="圖 4：結構化與 i.i.d. 異質性的對照。左：具可觀測協變量時，逐群組 TACT（無標籤）自 0.785 基準線逼近逐題最佳值，且對 SC 零損失。右：可證明封閉的 i.i.d. 情境，所有方法停留在基準線，含陰性對照在內。" title="" id="43" name="Picture"/>
             <a:graphic>
               <a:graphicData uri="http://schemas.openxmlformats.org/drawingml/2006/picture">
                 <pic:pic>
                   <pic:nvPicPr>
-                    <pic:cNvPr descr="figs/group_eval.png" id="42" name="Picture"/>
+                    <pic:cNvPr descr="figs/group_eval.png" id="44" name="Picture"/>
                     <pic:cNvPicPr>
                       <a:picLocks noChangeArrowheads="1" noChangeAspect="1"/>
                     </pic:cNvPicPr>
                   </pic:nvPicPr>
                   <pic:blipFill>
-                    <a:blip r:embed="rId40"/>
+                    <a:blip r:embed="rId42"/>
                     <a:stretch>
                       <a:fillRect/>
                     </a:stretch>
@@ -22992,8 +22974,8 @@
         <w:t xml:space="preserve">情境，所有方法停留在基準線，含陰性對照在內。</w:t>
       </w:r>
     </w:p>
-    <w:bookmarkEnd w:id="43"/>
-    <w:bookmarkStart w:id="44" w:name="小型-dev-集與證偽結果"/>
+    <w:bookmarkEnd w:id="45"/>
+    <w:bookmarkStart w:id="46" w:name="小型-dev-集與證偽結果"/>
     <w:p>
       <w:pPr>
         <w:pStyle w:val="Heading3"/>
@@ -23530,8 +23512,8 @@
         <w:t xml:space="preserve">），以及網格無法執行的無標籤運作。</w:t>
       </w:r>
     </w:p>
-    <w:bookmarkEnd w:id="44"/>
-    <w:bookmarkStart w:id="45" w:name="實作的驗證"/>
+    <w:bookmarkEnd w:id="46"/>
+    <w:bookmarkStart w:id="47" w:name="實作的驗證"/>
     <w:p>
       <w:pPr>
         <w:pStyle w:val="Heading3"/>
@@ -24274,8 +24256,8 @@
         <w:t xml:space="preserve">停止保證」的說法）確實失敗，以防後續修改悄悄將其復原。</w:t>
       </w:r>
     </w:p>
-    <w:bookmarkEnd w:id="45"/>
-    <w:bookmarkStart w:id="46" w:name="一個-harness-假象以及跨-seed-的離散度"/>
+    <w:bookmarkEnd w:id="47"/>
+    <w:bookmarkStart w:id="48" w:name="一個-harness-假象以及跨-seed-的離散度"/>
     <w:p>
       <w:pPr>
         <w:pStyle w:val="Heading3"/>
@@ -25423,8 +25405,8 @@
         <w:t xml:space="preserve">會同時藏住這個假象，以及「中段落差是系統性的」這個事實。</w:t>
       </w:r>
     </w:p>
-    <w:bookmarkEnd w:id="46"/>
-    <w:bookmarkStart w:id="47" w:name="真實軌跡驗證"/>
+    <w:bookmarkEnd w:id="48"/>
+    <w:bookmarkStart w:id="49" w:name="真實軌跡驗證"/>
     <w:p>
       <w:pPr>
         <w:pStyle w:val="Heading3"/>
@@ -27370,8 +27352,8 @@
         <w:t xml:space="preserve">節就去做了。</w:t>
       </w:r>
     </w:p>
-    <w:bookmarkEnd w:id="47"/>
-    <w:bookmarkStart w:id="48" w:name="更難題目上的確認實驗"/>
+    <w:bookmarkEnd w:id="49"/>
+    <w:bookmarkStart w:id="50" w:name="更難題目上的確認實驗"/>
     <w:p>
       <w:pPr>
         <w:pStyle w:val="Heading3"/>
@@ -28687,8 +28669,8 @@
         <w:t xml:space="preserve">。只要軌跡是分批收集的，批次大小就該進實驗紀錄。</w:t>
       </w:r>
     </w:p>
-    <w:bookmarkEnd w:id="48"/>
-    <w:bookmarkStart w:id="49" w:name="可作用的分層有多寬"/>
+    <w:bookmarkEnd w:id="50"/>
+    <w:bookmarkStart w:id="51" w:name="可作用的分層有多寬"/>
     <w:p>
       <w:pPr>
         <w:pStyle w:val="Heading3"/>
@@ -29789,8 +29771,8 @@
         <w:t xml:space="preserve">和能力牆長得一模一樣。</w:t>
       </w:r>
     </w:p>
-    <w:bookmarkEnd w:id="49"/>
-    <w:bookmarkStart w:id="50" w:name="第三軸推理預算"/>
+    <w:bookmarkEnd w:id="51"/>
+    <w:bookmarkStart w:id="52" w:name="第三軸推理預算"/>
     <w:p>
       <w:pPr>
         <w:pStyle w:val="Heading3"/>
@@ -30554,9 +30536,9 @@
         <w:t xml:space="preserve">題，信心加權能碰到的不到其中一半，而且沒有任何一種可達設定達到顯著。</w:t>
       </w:r>
     </w:p>
-    <w:bookmarkEnd w:id="50"/>
-    <w:bookmarkEnd w:id="51"/>
-    <w:bookmarkStart w:id="52" w:name="九討論與限制"/>
+    <w:bookmarkEnd w:id="52"/>
+    <w:bookmarkEnd w:id="53"/>
+    <w:bookmarkStart w:id="54" w:name="九討論與限制"/>
     <w:p>
       <w:pPr>
         <w:pStyle w:val="Heading2"/>
@@ -31452,8 +31434,8 @@
         <w:t xml:space="preserve">），但這需要在不只一個基質上確認才能相信。一個會自己選解碼預算來最大化決定性分層、然後才聚合的方法，會是與本文不同的貢獻；而這裡的量測正是它值得一試的理由。</w:t>
       </w:r>
     </w:p>
-    <w:bookmarkEnd w:id="52"/>
-    <w:bookmarkStart w:id="53" w:name="十結論"/>
+    <w:bookmarkEnd w:id="54"/>
+    <w:bookmarkStart w:id="55" w:name="十結論"/>
     <w:p>
       <w:pPr>
         <w:pStyle w:val="Heading2"/>
@@ -31530,8 +31512,8 @@
         <w:t xml:space="preserve">都無法通過預先登記的終點。在這種區域裡，一個估計器有用的性質是知道什麼時候不要動手，而死區正是精確地做到這件事。</w:t>
       </w:r>
     </w:p>
-    <w:bookmarkEnd w:id="53"/>
-    <w:bookmarkStart w:id="55" w:name="程式碼與資料可得性"/>
+    <w:bookmarkEnd w:id="55"/>
+    <w:bookmarkStart w:id="57" w:name="程式碼與資料可得性"/>
     <w:p>
       <w:pPr>
         <w:pStyle w:val="Heading2"/>
@@ -31565,7 +31547,7 @@
       <w:r>
         <w:t xml:space="preserve"> </w:t>
       </w:r>
-      <w:hyperlink r:id="rId54">
+      <w:hyperlink r:id="rId56">
         <w:r>
           <w:rPr>
             <w:rStyle w:val="Hyperlink"/>
@@ -31778,8 +31760,8 @@
         <w:t xml:space="preserve">後輸出的向量圖。</w:t>
       </w:r>
     </w:p>
-    <w:bookmarkEnd w:id="55"/>
-    <w:bookmarkStart w:id="56" w:name="附錄符號表"/>
+    <w:bookmarkEnd w:id="57"/>
+    <w:bookmarkStart w:id="58" w:name="附錄符號表"/>
     <w:p>
       <w:pPr>
         <w:pStyle w:val="Heading2"/>
@@ -34053,8 +34035,8 @@
         </w:tc>
       </w:tr>
     </w:tbl>
-    <w:bookmarkEnd w:id="56"/>
-    <w:bookmarkStart w:id="111" w:name="參考文獻"/>
+    <w:bookmarkEnd w:id="58"/>
+    <w:bookmarkStart w:id="113" w:name="參考文獻"/>
     <w:p>
       <w:pPr>
         <w:pStyle w:val="Heading2"/>
@@ -34070,7 +34052,7 @@
       <w:pPr>
         <w:pStyle w:val="FirstParagraph"/>
       </w:pPr>
-      <w:bookmarkStart w:id="57" w:name="ref1"/>
+      <w:bookmarkStart w:id="59" w:name="ref1"/>
       <w:r>
         <w:rPr>
           <w:b/>
@@ -34078,7 +34060,7 @@
         </w:rPr>
         <w:t xml:space="preserve">[1]</w:t>
       </w:r>
-      <w:bookmarkEnd w:id="57"/>
+      <w:bookmarkEnd w:id="59"/>
       <w:r>
         <w:t xml:space="preserve"> </w:t>
       </w:r>
@@ -34106,75 +34088,6 @@
           <w:iCs/>
         </w:rPr>
         <w:t xml:space="preserve">Proc. ICLR</w:t>
-      </w:r>
-      <w:r>
-        <w:t xml:space="preserve">, 2023. ·</w:t>
-      </w:r>
-      <w:r>
-        <w:t xml:space="preserve"> </w:t>
-      </w:r>
-      <w:hyperlink r:id="rId58">
-        <w:r>
-          <w:rPr>
-            <w:rStyle w:val="Hyperlink"/>
-          </w:rPr>
-          <w:t xml:space="preserve">PDF</w:t>
-        </w:r>
-      </w:hyperlink>
-    </w:p>
-    <w:p>
-      <w:pPr>
-        <w:pStyle w:val="BodyText"/>
-      </w:pPr>
-      <w:bookmarkStart w:id="59" w:name="ref2"/>
-      <w:r>
-        <w:rPr>
-          <w:b/>
-          <w:bCs/>
-        </w:rPr>
-        <w:t xml:space="preserve">[2]</w:t>
-      </w:r>
-      <w:bookmarkEnd w:id="59"/>
-      <w:r>
-        <w:t xml:space="preserve"> </w:t>
-      </w:r>
-      <w:r>
-        <w:t xml:space="preserve">K. Tian</w:t>
-      </w:r>
-      <w:r>
-        <w:t xml:space="preserve"> </w:t>
-      </w:r>
-      <w:r>
-        <w:rPr>
-          <w:i/>
-          <w:iCs/>
-        </w:rPr>
-        <w:t xml:space="preserve">et al.</w:t>
-      </w:r>
-      <w:r>
-        <w:t xml:space="preserve">,</w:t>
-      </w:r>
-      <w:r>
-        <w:t xml:space="preserve"> </w:t>
-      </w:r>
-      <w:r>
-        <w:t xml:space="preserve">“Just ask for calibration: Strategies for eliciting calibrated confidence scores from language models fine-tuned with human feedback,”</w:t>
-      </w:r>
-      <w:r>
-        <w:t xml:space="preserve"> </w:t>
-      </w:r>
-      <w:r>
-        <w:t xml:space="preserve">in</w:t>
-      </w:r>
-      <w:r>
-        <w:t xml:space="preserve"> </w:t>
-      </w:r>
-      <w:r>
-        <w:rPr>
-          <w:i/>
-          <w:iCs/>
-        </w:rPr>
-        <w:t xml:space="preserve">Proc. EMNLP</w:t>
       </w:r>
       <w:r>
         <w:t xml:space="preserve">, 2023. ·</w:t>
@@ -34195,20 +34108,20 @@
       <w:pPr>
         <w:pStyle w:val="BodyText"/>
       </w:pPr>
-      <w:bookmarkStart w:id="61" w:name="ref3"/>
+      <w:bookmarkStart w:id="61" w:name="ref2"/>
       <w:r>
         <w:rPr>
           <w:b/>
           <w:bCs/>
         </w:rPr>
-        <w:t xml:space="preserve">[3]</w:t>
+        <w:t xml:space="preserve">[2]</w:t>
       </w:r>
       <w:bookmarkEnd w:id="61"/>
       <w:r>
         <w:t xml:space="preserve"> </w:t>
       </w:r>
       <w:r>
-        <w:t xml:space="preserve">M. Xiong</w:t>
+        <w:t xml:space="preserve">K. Tian</w:t>
       </w:r>
       <w:r>
         <w:t xml:space="preserve"> </w:t>
@@ -34227,7 +34140,7 @@
         <w:t xml:space="preserve"> </w:t>
       </w:r>
       <w:r>
-        <w:t xml:space="preserve">“Can LLMs express their uncertainty? An empirical evaluation of confidence elicitation in LLMs,”</w:t>
+        <w:t xml:space="preserve">“Just ask for calibration: Strategies for eliciting calibrated confidence scores from language models fine-tuned with human feedback,”</w:t>
       </w:r>
       <w:r>
         <w:t xml:space="preserve"> </w:t>
@@ -34243,10 +34156,10 @@
           <w:i/>
           <w:iCs/>
         </w:rPr>
-        <w:t xml:space="preserve">Proc. ICLR</w:t>
-      </w:r>
-      <w:r>
-        <w:t xml:space="preserve">, 2024. ·</w:t>
+        <w:t xml:space="preserve">Proc. EMNLP</w:t>
+      </w:r>
+      <w:r>
+        <w:t xml:space="preserve">, 2023. ·</w:t>
       </w:r>
       <w:r>
         <w:t xml:space="preserve"> </w:t>
@@ -34264,20 +34177,20 @@
       <w:pPr>
         <w:pStyle w:val="BodyText"/>
       </w:pPr>
-      <w:bookmarkStart w:id="63" w:name="ref4"/>
+      <w:bookmarkStart w:id="63" w:name="ref3"/>
       <w:r>
         <w:rPr>
           <w:b/>
           <w:bCs/>
         </w:rPr>
-        <w:t xml:space="preserve">[4]</w:t>
+        <w:t xml:space="preserve">[3]</w:t>
       </w:r>
       <w:bookmarkEnd w:id="63"/>
       <w:r>
         <w:t xml:space="preserve"> </w:t>
       </w:r>
       <w:r>
-        <w:t xml:space="preserve">S. Kadavath</w:t>
+        <w:t xml:space="preserve">M. Xiong</w:t>
       </w:r>
       <w:r>
         <w:t xml:space="preserve"> </w:t>
@@ -34296,13 +34209,26 @@
         <w:t xml:space="preserve"> </w:t>
       </w:r>
       <w:r>
-        <w:t xml:space="preserve">“Language models (mostly) know what they know,”</w:t>
-      </w:r>
-      <w:r>
-        <w:t xml:space="preserve"> </w:t>
-      </w:r>
-      <w:r>
-        <w:t xml:space="preserve">arXiv:2207.05221, 2022. ·</w:t>
+        <w:t xml:space="preserve">“Can LLMs express their uncertainty? An empirical evaluation of confidence elicitation in LLMs,”</w:t>
+      </w:r>
+      <w:r>
+        <w:t xml:space="preserve"> </w:t>
+      </w:r>
+      <w:r>
+        <w:t xml:space="preserve">in</w:t>
+      </w:r>
+      <w:r>
+        <w:t xml:space="preserve"> </w:t>
+      </w:r>
+      <w:r>
+        <w:rPr>
+          <w:i/>
+          <w:iCs/>
+        </w:rPr>
+        <w:t xml:space="preserve">Proc. ICLR</w:t>
+      </w:r>
+      <w:r>
+        <w:t xml:space="preserve">, 2024. ·</w:t>
       </w:r>
       <w:r>
         <w:t xml:space="preserve"> </w:t>
@@ -34320,20 +34246,20 @@
       <w:pPr>
         <w:pStyle w:val="BodyText"/>
       </w:pPr>
-      <w:bookmarkStart w:id="65" w:name="ref5"/>
+      <w:bookmarkStart w:id="65" w:name="ref4"/>
       <w:r>
         <w:rPr>
           <w:b/>
           <w:bCs/>
         </w:rPr>
-        <w:t xml:space="preserve">[5]</w:t>
+        <w:t xml:space="preserve">[4]</w:t>
       </w:r>
       <w:bookmarkEnd w:id="65"/>
       <w:r>
         <w:t xml:space="preserve"> </w:t>
       </w:r>
       <w:r>
-        <w:t xml:space="preserve">A. Taubenfeld</w:t>
+        <w:t xml:space="preserve">S. Kadavath</w:t>
       </w:r>
       <w:r>
         <w:t xml:space="preserve"> </w:t>
@@ -34352,26 +34278,13 @@
         <w:t xml:space="preserve"> </w:t>
       </w:r>
       <w:r>
-        <w:t xml:space="preserve">“Confidence improves self-consistency in LLMs,”</w:t>
-      </w:r>
-      <w:r>
-        <w:t xml:space="preserve"> </w:t>
-      </w:r>
-      <w:r>
-        <w:t xml:space="preserve">in</w:t>
-      </w:r>
-      <w:r>
-        <w:t xml:space="preserve"> </w:t>
-      </w:r>
-      <w:r>
-        <w:rPr>
-          <w:i/>
-          <w:iCs/>
-        </w:rPr>
-        <w:t xml:space="preserve">Findings of ACL</w:t>
-      </w:r>
-      <w:r>
-        <w:t xml:space="preserve">, 2025, arXiv:2502.06233. ·</w:t>
+        <w:t xml:space="preserve">“Language models (mostly) know what they know,”</w:t>
+      </w:r>
+      <w:r>
+        <w:t xml:space="preserve"> </w:t>
+      </w:r>
+      <w:r>
+        <w:t xml:space="preserve">arXiv:2207.05221, 2022. ·</w:t>
       </w:r>
       <w:r>
         <w:t xml:space="preserve"> </w:t>
@@ -34389,32 +34302,20 @@
       <w:pPr>
         <w:pStyle w:val="BodyText"/>
       </w:pPr>
-      <w:bookmarkStart w:id="67" w:name="ref6"/>
+      <w:bookmarkStart w:id="67" w:name="ref5"/>
       <w:r>
         <w:rPr>
           <w:b/>
           <w:bCs/>
         </w:rPr>
-        <w:t xml:space="preserve">[6]</w:t>
+        <w:t xml:space="preserve">[5]</w:t>
       </w:r>
       <w:bookmarkEnd w:id="67"/>
       <w:r>
         <w:t xml:space="preserve"> </w:t>
       </w:r>
       <w:r>
-        <w:t xml:space="preserve">J. Kim, N. Yang, K. Min, and K. Jung,</w:t>
-      </w:r>
-      <w:r>
-        <w:t xml:space="preserve"> </w:t>
-      </w:r>
-      <w:r>
-        <w:t xml:space="preserve">“Reliability-aware adaptive self-consistency for efficient sampling in LLM reasoning,”</w:t>
-      </w:r>
-      <w:r>
-        <w:t xml:space="preserve"> </w:t>
-      </w:r>
-      <w:r>
-        <w:t xml:space="preserve">in</w:t>
+        <w:t xml:space="preserve">A. Taubenfeld</w:t>
       </w:r>
       <w:r>
         <w:t xml:space="preserve"> </w:t>
@@ -34424,10 +34325,35 @@
           <w:i/>
           <w:iCs/>
         </w:rPr>
+        <w:t xml:space="preserve">et al.</w:t>
+      </w:r>
+      <w:r>
+        <w:t xml:space="preserve">,</w:t>
+      </w:r>
+      <w:r>
+        <w:t xml:space="preserve"> </w:t>
+      </w:r>
+      <w:r>
+        <w:t xml:space="preserve">“Confidence improves self-consistency in LLMs,”</w:t>
+      </w:r>
+      <w:r>
+        <w:t xml:space="preserve"> </w:t>
+      </w:r>
+      <w:r>
+        <w:t xml:space="preserve">in</w:t>
+      </w:r>
+      <w:r>
+        <w:t xml:space="preserve"> </w:t>
+      </w:r>
+      <w:r>
+        <w:rPr>
+          <w:i/>
+          <w:iCs/>
+        </w:rPr>
         <w:t xml:space="preserve">Findings of ACL</w:t>
       </w:r>
       <w:r>
-        <w:t xml:space="preserve">, 2026, pp. 21575–21590. ·</w:t>
+        <w:t xml:space="preserve">, 2025, arXiv:2502.06233. ·</w:t>
       </w:r>
       <w:r>
         <w:t xml:space="preserve"> </w:t>
@@ -34445,20 +34371,32 @@
       <w:pPr>
         <w:pStyle w:val="BodyText"/>
       </w:pPr>
-      <w:bookmarkStart w:id="69" w:name="ref7"/>
+      <w:bookmarkStart w:id="69" w:name="ref6"/>
       <w:r>
         <w:rPr>
           <w:b/>
           <w:bCs/>
         </w:rPr>
-        <w:t xml:space="preserve">[7]</w:t>
+        <w:t xml:space="preserve">[6]</w:t>
       </w:r>
       <w:bookmarkEnd w:id="69"/>
       <w:r>
         <w:t xml:space="preserve"> </w:t>
       </w:r>
       <w:r>
-        <w:t xml:space="preserve">Y. Fu</w:t>
+        <w:t xml:space="preserve">J. Kim, N. Yang, K. Min, and K. Jung,</w:t>
+      </w:r>
+      <w:r>
+        <w:t xml:space="preserve"> </w:t>
+      </w:r>
+      <w:r>
+        <w:t xml:space="preserve">“Reliability-aware adaptive self-consistency for efficient sampling in LLM reasoning,”</w:t>
+      </w:r>
+      <w:r>
+        <w:t xml:space="preserve"> </w:t>
+      </w:r>
+      <w:r>
+        <w:t xml:space="preserve">in</w:t>
       </w:r>
       <w:r>
         <w:t xml:space="preserve"> </w:t>
@@ -34468,22 +34406,10 @@
           <w:i/>
           <w:iCs/>
         </w:rPr>
-        <w:t xml:space="preserve">et al.</w:t>
-      </w:r>
-      <w:r>
-        <w:t xml:space="preserve">,</w:t>
-      </w:r>
-      <w:r>
-        <w:t xml:space="preserve"> </w:t>
-      </w:r>
-      <w:r>
-        <w:t xml:space="preserve">“Deep think with confidence,”</w:t>
-      </w:r>
-      <w:r>
-        <w:t xml:space="preserve"> </w:t>
-      </w:r>
-      <w:r>
-        <w:t xml:space="preserve">arXiv:2508.15260, 2025. ·</w:t>
+        <w:t xml:space="preserve">Findings of ACL</w:t>
+      </w:r>
+      <w:r>
+        <w:t xml:space="preserve">, 2026, pp. 21575–21590. ·</w:t>
       </w:r>
       <w:r>
         <w:t xml:space="preserve"> </w:t>
@@ -34501,32 +34427,20 @@
       <w:pPr>
         <w:pStyle w:val="BodyText"/>
       </w:pPr>
-      <w:bookmarkStart w:id="71" w:name="ref8"/>
+      <w:bookmarkStart w:id="71" w:name="ref7"/>
       <w:r>
         <w:rPr>
           <w:b/>
           <w:bCs/>
         </w:rPr>
-        <w:t xml:space="preserve">[8]</w:t>
+        <w:t xml:space="preserve">[7]</w:t>
       </w:r>
       <w:bookmarkEnd w:id="71"/>
       <w:r>
         <w:t xml:space="preserve"> </w:t>
       </w:r>
       <w:r>
-        <w:t xml:space="preserve">X. Huang, S. Li, M. Yu, M. Sesia, H. Hassani, I. Lee, O. Bastani, and E. Dobriban,</w:t>
-      </w:r>
-      <w:r>
-        <w:t xml:space="preserve"> </w:t>
-      </w:r>
-      <w:r>
-        <w:t xml:space="preserve">“Uncertainty in language models: Assessment through rank-calibration,”</w:t>
-      </w:r>
-      <w:r>
-        <w:t xml:space="preserve"> </w:t>
-      </w:r>
-      <w:r>
-        <w:t xml:space="preserve">in</w:t>
+        <w:t xml:space="preserve">Y. Fu</w:t>
       </w:r>
       <w:r>
         <w:t xml:space="preserve"> </w:t>
@@ -34536,10 +34450,22 @@
           <w:i/>
           <w:iCs/>
         </w:rPr>
-        <w:t xml:space="preserve">Proc. EMNLP</w:t>
-      </w:r>
-      <w:r>
-        <w:t xml:space="preserve">, 2024, pp. 284–312. ·</w:t>
+        <w:t xml:space="preserve">et al.</w:t>
+      </w:r>
+      <w:r>
+        <w:t xml:space="preserve">,</w:t>
+      </w:r>
+      <w:r>
+        <w:t xml:space="preserve"> </w:t>
+      </w:r>
+      <w:r>
+        <w:t xml:space="preserve">“Deep think with confidence,”</w:t>
+      </w:r>
+      <w:r>
+        <w:t xml:space="preserve"> </w:t>
+      </w:r>
+      <w:r>
+        <w:t xml:space="preserve">arXiv:2508.15260, 2025. ·</w:t>
       </w:r>
       <w:r>
         <w:t xml:space="preserve"> </w:t>
@@ -34557,26 +34483,32 @@
       <w:pPr>
         <w:pStyle w:val="BodyText"/>
       </w:pPr>
-      <w:bookmarkStart w:id="73" w:name="ref9"/>
+      <w:bookmarkStart w:id="73" w:name="ref8"/>
       <w:r>
         <w:rPr>
           <w:b/>
           <w:bCs/>
         </w:rPr>
-        <w:t xml:space="preserve">[9]</w:t>
+        <w:t xml:space="preserve">[8]</w:t>
       </w:r>
       <w:bookmarkEnd w:id="73"/>
       <w:r>
         <w:t xml:space="preserve"> </w:t>
       </w:r>
       <w:r>
-        <w:t xml:space="preserve">A. P. Dawid and A. M. Skene,</w:t>
-      </w:r>
-      <w:r>
-        <w:t xml:space="preserve"> </w:t>
-      </w:r>
-      <w:r>
-        <w:t xml:space="preserve">“Maximum likelihood estimation of observer error-rates using the EM algorithm,”</w:t>
+        <w:t xml:space="preserve">X. Huang, S. Li, M. Yu, M. Sesia, H. Hassani, I. Lee, O. Bastani, and E. Dobriban,</w:t>
+      </w:r>
+      <w:r>
+        <w:t xml:space="preserve"> </w:t>
+      </w:r>
+      <w:r>
+        <w:t xml:space="preserve">“Uncertainty in language models: Assessment through rank-calibration,”</w:t>
+      </w:r>
+      <w:r>
+        <w:t xml:space="preserve"> </w:t>
+      </w:r>
+      <w:r>
+        <w:t xml:space="preserve">in</w:t>
       </w:r>
       <w:r>
         <w:t xml:space="preserve"> </w:t>
@@ -34586,10 +34518,10 @@
           <w:i/>
           <w:iCs/>
         </w:rPr>
-        <w:t xml:space="preserve">J. Roy. Statist. Soc. C</w:t>
-      </w:r>
-      <w:r>
-        <w:t xml:space="preserve">, vol. 28, no. 1, pp. 20–28, 1979. ·</w:t>
+        <w:t xml:space="preserve">Proc. EMNLP</w:t>
+      </w:r>
+      <w:r>
+        <w:t xml:space="preserve">, 2024, pp. 284–312. ·</w:t>
       </w:r>
       <w:r>
         <w:t xml:space="preserve"> </w:t>
@@ -34607,26 +34539,26 @@
       <w:pPr>
         <w:pStyle w:val="BodyText"/>
       </w:pPr>
-      <w:bookmarkStart w:id="75" w:name="ref10"/>
+      <w:bookmarkStart w:id="75" w:name="ref9"/>
       <w:r>
         <w:rPr>
           <w:b/>
           <w:bCs/>
         </w:rPr>
-        <w:t xml:space="preserve">[10]</w:t>
+        <w:t xml:space="preserve">[9]</w:t>
       </w:r>
       <w:bookmarkEnd w:id="75"/>
       <w:r>
         <w:t xml:space="preserve"> </w:t>
       </w:r>
       <w:r>
-        <w:t xml:space="preserve">F. Parisi, F. Strino, B. Nadler, and Y. Kluger,</w:t>
-      </w:r>
-      <w:r>
-        <w:t xml:space="preserve"> </w:t>
-      </w:r>
-      <w:r>
-        <w:t xml:space="preserve">“Ranking and combining multiple predictors without labeled data,”</w:t>
+        <w:t xml:space="preserve">A. P. Dawid and A. M. Skene,</w:t>
+      </w:r>
+      <w:r>
+        <w:t xml:space="preserve"> </w:t>
+      </w:r>
+      <w:r>
+        <w:t xml:space="preserve">“Maximum likelihood estimation of observer error-rates using the EM algorithm,”</w:t>
       </w:r>
       <w:r>
         <w:t xml:space="preserve"> </w:t>
@@ -34636,10 +34568,10 @@
           <w:i/>
           <w:iCs/>
         </w:rPr>
-        <w:t xml:space="preserve">Proc. Natl. Acad. Sci.</w:t>
-      </w:r>
-      <w:r>
-        <w:t xml:space="preserve">, vol. 111, no. 4, pp. 1253–1258, 2014. ·</w:t>
+        <w:t xml:space="preserve">J. Roy. Statist. Soc. C</w:t>
+      </w:r>
+      <w:r>
+        <w:t xml:space="preserve">, vol. 28, no. 1, pp. 20–28, 1979. ·</w:t>
       </w:r>
       <w:r>
         <w:t xml:space="preserve"> </w:t>
@@ -34657,20 +34589,26 @@
       <w:pPr>
         <w:pStyle w:val="BodyText"/>
       </w:pPr>
-      <w:bookmarkStart w:id="77" w:name="ref11"/>
+      <w:bookmarkStart w:id="77" w:name="ref10"/>
       <w:r>
         <w:rPr>
           <w:b/>
           <w:bCs/>
         </w:rPr>
-        <w:t xml:space="preserve">[11]</w:t>
+        <w:t xml:space="preserve">[10]</w:t>
       </w:r>
       <w:bookmarkEnd w:id="77"/>
       <w:r>
         <w:t xml:space="preserve"> </w:t>
       </w:r>
       <w:r>
-        <w:t xml:space="preserve">Y. Li</w:t>
+        <w:t xml:space="preserve">F. Parisi, F. Strino, B. Nadler, and Y. Kluger,</w:t>
+      </w:r>
+      <w:r>
+        <w:t xml:space="preserve"> </w:t>
+      </w:r>
+      <w:r>
+        <w:t xml:space="preserve">“Ranking and combining multiple predictors without labeled data,”</w:t>
       </w:r>
       <w:r>
         <w:t xml:space="preserve"> </w:t>
@@ -34680,35 +34618,10 @@
           <w:i/>
           <w:iCs/>
         </w:rPr>
-        <w:t xml:space="preserve">et al.</w:t>
-      </w:r>
-      <w:r>
-        <w:t xml:space="preserve">,</w:t>
-      </w:r>
-      <w:r>
-        <w:t xml:space="preserve"> </w:t>
-      </w:r>
-      <w:r>
-        <w:t xml:space="preserve">“Making language models better reasoners with step-aware verifier,”</w:t>
-      </w:r>
-      <w:r>
-        <w:t xml:space="preserve"> </w:t>
-      </w:r>
-      <w:r>
-        <w:t xml:space="preserve">in</w:t>
-      </w:r>
-      <w:r>
-        <w:t xml:space="preserve"> </w:t>
-      </w:r>
-      <w:r>
-        <w:rPr>
-          <w:i/>
-          <w:iCs/>
-        </w:rPr>
-        <w:t xml:space="preserve">Proc. ACL</w:t>
-      </w:r>
-      <w:r>
-        <w:t xml:space="preserve">, 2023. ·</w:t>
+        <w:t xml:space="preserve">Proc. Natl. Acad. Sci.</w:t>
+      </w:r>
+      <w:r>
+        <w:t xml:space="preserve">, vol. 111, no. 4, pp. 1253–1258, 2014. ·</w:t>
       </w:r>
       <w:r>
         <w:t xml:space="preserve"> </w:t>
@@ -34726,32 +34639,20 @@
       <w:pPr>
         <w:pStyle w:val="BodyText"/>
       </w:pPr>
-      <w:bookmarkStart w:id="79" w:name="ref12"/>
+      <w:bookmarkStart w:id="79" w:name="ref11"/>
       <w:r>
         <w:rPr>
           <w:b/>
           <w:bCs/>
         </w:rPr>
-        <w:t xml:space="preserve">[12]</w:t>
+        <w:t xml:space="preserve">[11]</w:t>
       </w:r>
       <w:bookmarkEnd w:id="79"/>
       <w:r>
         <w:t xml:space="preserve"> </w:t>
       </w:r>
       <w:r>
-        <w:t xml:space="preserve">P. Aggarwal, A. Madaan, Y. Yang, and Mausam,</w:t>
-      </w:r>
-      <w:r>
-        <w:t xml:space="preserve"> </w:t>
-      </w:r>
-      <w:r>
-        <w:t xml:space="preserve">“Let’s sample step by step: Adaptive-consistency for efficient reasoning and coding with LLMs,”</w:t>
-      </w:r>
-      <w:r>
-        <w:t xml:space="preserve"> </w:t>
-      </w:r>
-      <w:r>
-        <w:t xml:space="preserve">in</w:t>
+        <w:t xml:space="preserve">Y. Li</w:t>
       </w:r>
       <w:r>
         <w:t xml:space="preserve"> </w:t>
@@ -34761,10 +34662,35 @@
           <w:i/>
           <w:iCs/>
         </w:rPr>
-        <w:t xml:space="preserve">Proc. EMNLP</w:t>
-      </w:r>
-      <w:r>
-        <w:t xml:space="preserve">, 2023, pp. 12375–12396. ·</w:t>
+        <w:t xml:space="preserve">et al.</w:t>
+      </w:r>
+      <w:r>
+        <w:t xml:space="preserve">,</w:t>
+      </w:r>
+      <w:r>
+        <w:t xml:space="preserve"> </w:t>
+      </w:r>
+      <w:r>
+        <w:t xml:space="preserve">“Making language models better reasoners with step-aware verifier,”</w:t>
+      </w:r>
+      <w:r>
+        <w:t xml:space="preserve"> </w:t>
+      </w:r>
+      <w:r>
+        <w:t xml:space="preserve">in</w:t>
+      </w:r>
+      <w:r>
+        <w:t xml:space="preserve"> </w:t>
+      </w:r>
+      <w:r>
+        <w:rPr>
+          <w:i/>
+          <w:iCs/>
+        </w:rPr>
+        <w:t xml:space="preserve">Proc. ACL</w:t>
+      </w:r>
+      <w:r>
+        <w:t xml:space="preserve">, 2023. ·</w:t>
       </w:r>
       <w:r>
         <w:t xml:space="preserve"> </w:t>
@@ -34782,20 +34708,32 @@
       <w:pPr>
         <w:pStyle w:val="BodyText"/>
       </w:pPr>
-      <w:bookmarkStart w:id="81" w:name="ref13"/>
+      <w:bookmarkStart w:id="81" w:name="ref12"/>
       <w:r>
         <w:rPr>
           <w:b/>
           <w:bCs/>
         </w:rPr>
-        <w:t xml:space="preserve">[13]</w:t>
+        <w:t xml:space="preserve">[12]</w:t>
       </w:r>
       <w:bookmarkEnd w:id="81"/>
       <w:r>
         <w:t xml:space="preserve"> </w:t>
       </w:r>
       <w:r>
-        <w:t xml:space="preserve">Y. Li</w:t>
+        <w:t xml:space="preserve">P. Aggarwal, A. Madaan, Y. Yang, and Mausam,</w:t>
+      </w:r>
+      <w:r>
+        <w:t xml:space="preserve"> </w:t>
+      </w:r>
+      <w:r>
+        <w:t xml:space="preserve">“Let’s sample step by step: Adaptive-consistency for efficient reasoning and coding with LLMs,”</w:t>
+      </w:r>
+      <w:r>
+        <w:t xml:space="preserve"> </w:t>
+      </w:r>
+      <w:r>
+        <w:t xml:space="preserve">in</w:t>
       </w:r>
       <w:r>
         <w:t xml:space="preserve"> </w:t>
@@ -34805,35 +34743,10 @@
           <w:i/>
           <w:iCs/>
         </w:rPr>
-        <w:t xml:space="preserve">et al.</w:t>
-      </w:r>
-      <w:r>
-        <w:t xml:space="preserve">,</w:t>
-      </w:r>
-      <w:r>
-        <w:t xml:space="preserve"> </w:t>
-      </w:r>
-      <w:r>
-        <w:t xml:space="preserve">“Escape sky-high cost: Early-stopping self-consistency for multi-step reasoning,”</w:t>
-      </w:r>
-      <w:r>
-        <w:t xml:space="preserve"> </w:t>
-      </w:r>
-      <w:r>
-        <w:t xml:space="preserve">in</w:t>
-      </w:r>
-      <w:r>
-        <w:t xml:space="preserve"> </w:t>
-      </w:r>
-      <w:r>
-        <w:rPr>
-          <w:i/>
-          <w:iCs/>
-        </w:rPr>
-        <w:t xml:space="preserve">Proc. ICLR</w:t>
-      </w:r>
-      <w:r>
-        <w:t xml:space="preserve">, 2024. ·</w:t>
+        <w:t xml:space="preserve">Proc. EMNLP</w:t>
+      </w:r>
+      <w:r>
+        <w:t xml:space="preserve">, 2023, pp. 12375–12396. ·</w:t>
       </w:r>
       <w:r>
         <w:t xml:space="preserve"> </w:t>
@@ -34851,32 +34764,20 @@
       <w:pPr>
         <w:pStyle w:val="BodyText"/>
       </w:pPr>
-      <w:bookmarkStart w:id="83" w:name="ref14"/>
+      <w:bookmarkStart w:id="83" w:name="ref13"/>
       <w:r>
         <w:rPr>
           <w:b/>
           <w:bCs/>
         </w:rPr>
-        <w:t xml:space="preserve">[14]</w:t>
+        <w:t xml:space="preserve">[13]</w:t>
       </w:r>
       <w:bookmarkEnd w:id="83"/>
       <w:r>
         <w:t xml:space="preserve"> </w:t>
       </w:r>
       <w:r>
-        <w:t xml:space="preserve">Z. Kang, X. Zhao, and D. Song,</w:t>
-      </w:r>
-      <w:r>
-        <w:t xml:space="preserve"> </w:t>
-      </w:r>
-      <w:r>
-        <w:t xml:space="preserve">“Scalable best-of-N selection for large language models via self-certainty,”</w:t>
-      </w:r>
-      <w:r>
-        <w:t xml:space="preserve"> </w:t>
-      </w:r>
-      <w:r>
-        <w:t xml:space="preserve">in</w:t>
+        <w:t xml:space="preserve">Y. Li</w:t>
       </w:r>
       <w:r>
         <w:t xml:space="preserve"> </w:t>
@@ -34886,10 +34787,35 @@
           <w:i/>
           <w:iCs/>
         </w:rPr>
-        <w:t xml:space="preserve">Proc. NeurIPS</w:t>
-      </w:r>
-      <w:r>
-        <w:t xml:space="preserve">, 2025, arXiv:2502.18581. ·</w:t>
+        <w:t xml:space="preserve">et al.</w:t>
+      </w:r>
+      <w:r>
+        <w:t xml:space="preserve">,</w:t>
+      </w:r>
+      <w:r>
+        <w:t xml:space="preserve"> </w:t>
+      </w:r>
+      <w:r>
+        <w:t xml:space="preserve">“Escape sky-high cost: Early-stopping self-consistency for multi-step reasoning,”</w:t>
+      </w:r>
+      <w:r>
+        <w:t xml:space="preserve"> </w:t>
+      </w:r>
+      <w:r>
+        <w:t xml:space="preserve">in</w:t>
+      </w:r>
+      <w:r>
+        <w:t xml:space="preserve"> </w:t>
+      </w:r>
+      <w:r>
+        <w:rPr>
+          <w:i/>
+          <w:iCs/>
+        </w:rPr>
+        <w:t xml:space="preserve">Proc. ICLR</w:t>
+      </w:r>
+      <w:r>
+        <w:t xml:space="preserve">, 2024. ·</w:t>
       </w:r>
       <w:r>
         <w:t xml:space="preserve"> </w:t>
@@ -34907,20 +34833,32 @@
       <w:pPr>
         <w:pStyle w:val="BodyText"/>
       </w:pPr>
-      <w:bookmarkStart w:id="85" w:name="ref15"/>
+      <w:bookmarkStart w:id="85" w:name="ref14"/>
       <w:r>
         <w:rPr>
           <w:b/>
           <w:bCs/>
         </w:rPr>
-        <w:t xml:space="preserve">[15]</w:t>
+        <w:t xml:space="preserve">[14]</w:t>
       </w:r>
       <w:bookmarkEnd w:id="85"/>
       <w:r>
         <w:t xml:space="preserve"> </w:t>
       </w:r>
       <w:r>
-        <w:t xml:space="preserve">J. Whitehill</w:t>
+        <w:t xml:space="preserve">Z. Kang, X. Zhao, and D. Song,</w:t>
+      </w:r>
+      <w:r>
+        <w:t xml:space="preserve"> </w:t>
+      </w:r>
+      <w:r>
+        <w:t xml:space="preserve">“Scalable best-of-N selection for large language models via self-certainty,”</w:t>
+      </w:r>
+      <w:r>
+        <w:t xml:space="preserve"> </w:t>
+      </w:r>
+      <w:r>
+        <w:t xml:space="preserve">in</w:t>
       </w:r>
       <w:r>
         <w:t xml:space="preserve"> </w:t>
@@ -34930,35 +34868,10 @@
           <w:i/>
           <w:iCs/>
         </w:rPr>
-        <w:t xml:space="preserve">et al.</w:t>
-      </w:r>
-      <w:r>
-        <w:t xml:space="preserve">,</w:t>
-      </w:r>
-      <w:r>
-        <w:t xml:space="preserve"> </w:t>
-      </w:r>
-      <w:r>
-        <w:t xml:space="preserve">“Whose vote should count more: Optimal integration of labels from labelers of unknown expertise,”</w:t>
-      </w:r>
-      <w:r>
-        <w:t xml:space="preserve"> </w:t>
-      </w:r>
-      <w:r>
-        <w:t xml:space="preserve">in</w:t>
-      </w:r>
-      <w:r>
-        <w:t xml:space="preserve"> </w:t>
-      </w:r>
-      <w:r>
-        <w:rPr>
-          <w:i/>
-          <w:iCs/>
-        </w:rPr>
         <w:t xml:space="preserve">Proc. NeurIPS</w:t>
       </w:r>
       <w:r>
-        <w:t xml:space="preserve">, 2009. ·</w:t>
+        <w:t xml:space="preserve">, 2025, arXiv:2502.18581. ·</w:t>
       </w:r>
       <w:r>
         <w:t xml:space="preserve"> </w:t>
@@ -34976,32 +34889,20 @@
       <w:pPr>
         <w:pStyle w:val="BodyText"/>
       </w:pPr>
-      <w:bookmarkStart w:id="87" w:name="ref16"/>
+      <w:bookmarkStart w:id="87" w:name="ref15"/>
       <w:r>
         <w:rPr>
           <w:b/>
           <w:bCs/>
         </w:rPr>
-        <w:t xml:space="preserve">[16]</w:t>
+        <w:t xml:space="preserve">[15]</w:t>
       </w:r>
       <w:bookmarkEnd w:id="87"/>
       <w:r>
         <w:t xml:space="preserve"> </w:t>
       </w:r>
       <w:r>
-        <w:t xml:space="preserve">D. R. Karger, S. Oh, and D. Shah,</w:t>
-      </w:r>
-      <w:r>
-        <w:t xml:space="preserve"> </w:t>
-      </w:r>
-      <w:r>
-        <w:t xml:space="preserve">“Iterative learning for reliable crowdsourcing systems,”</w:t>
-      </w:r>
-      <w:r>
-        <w:t xml:space="preserve"> </w:t>
-      </w:r>
-      <w:r>
-        <w:t xml:space="preserve">in</w:t>
+        <w:t xml:space="preserve">J. Whitehill</w:t>
       </w:r>
       <w:r>
         <w:t xml:space="preserve"> </w:t>
@@ -35011,10 +34912,35 @@
           <w:i/>
           <w:iCs/>
         </w:rPr>
+        <w:t xml:space="preserve">et al.</w:t>
+      </w:r>
+      <w:r>
+        <w:t xml:space="preserve">,</w:t>
+      </w:r>
+      <w:r>
+        <w:t xml:space="preserve"> </w:t>
+      </w:r>
+      <w:r>
+        <w:t xml:space="preserve">“Whose vote should count more: Optimal integration of labels from labelers of unknown expertise,”</w:t>
+      </w:r>
+      <w:r>
+        <w:t xml:space="preserve"> </w:t>
+      </w:r>
+      <w:r>
+        <w:t xml:space="preserve">in</w:t>
+      </w:r>
+      <w:r>
+        <w:t xml:space="preserve"> </w:t>
+      </w:r>
+      <w:r>
+        <w:rPr>
+          <w:i/>
+          <w:iCs/>
+        </w:rPr>
         <w:t xml:space="preserve">Proc. NeurIPS</w:t>
       </w:r>
       <w:r>
-        <w:t xml:space="preserve">, 2011. ·</w:t>
+        <w:t xml:space="preserve">, 2009. ·</w:t>
       </w:r>
       <w:r>
         <w:t xml:space="preserve"> </w:t>
@@ -35032,32 +34958,45 @@
       <w:pPr>
         <w:pStyle w:val="BodyText"/>
       </w:pPr>
-      <w:bookmarkStart w:id="89" w:name="ref17"/>
+      <w:bookmarkStart w:id="89" w:name="ref16"/>
       <w:r>
         <w:rPr>
           <w:b/>
           <w:bCs/>
         </w:rPr>
-        <w:t xml:space="preserve">[17]</w:t>
+        <w:t xml:space="preserve">[16]</w:t>
       </w:r>
       <w:bookmarkEnd w:id="89"/>
       <w:r>
         <w:t xml:space="preserve"> </w:t>
       </w:r>
       <w:r>
-        <w:t xml:space="preserve">J. Lee, V. Ma, S. Zhao, Y. Nair, A. Spector, R. Cohen, and E. J. Candès,</w:t>
-      </w:r>
-      <w:r>
-        <w:t xml:space="preserve"> </w:t>
-      </w:r>
-      <w:r>
-        <w:t xml:space="preserve">“FUSE: Ensembling verifiers with zero labeled data,”</w:t>
-      </w:r>
-      <w:r>
-        <w:t xml:space="preserve"> </w:t>
-      </w:r>
-      <w:r>
-        <w:t xml:space="preserve">arXiv:2604.18547, 2026. ·</w:t>
+        <w:t xml:space="preserve">D. R. Karger, S. Oh, and D. Shah,</w:t>
+      </w:r>
+      <w:r>
+        <w:t xml:space="preserve"> </w:t>
+      </w:r>
+      <w:r>
+        <w:t xml:space="preserve">“Iterative learning for reliable crowdsourcing systems,”</w:t>
+      </w:r>
+      <w:r>
+        <w:t xml:space="preserve"> </w:t>
+      </w:r>
+      <w:r>
+        <w:t xml:space="preserve">in</w:t>
+      </w:r>
+      <w:r>
+        <w:t xml:space="preserve"> </w:t>
+      </w:r>
+      <w:r>
+        <w:rPr>
+          <w:i/>
+          <w:iCs/>
+        </w:rPr>
+        <w:t xml:space="preserve">Proc. NeurIPS</w:t>
+      </w:r>
+      <w:r>
+        <w:t xml:space="preserve">, 2011. ·</w:t>
       </w:r>
       <w:r>
         <w:t xml:space="preserve"> </w:t>
@@ -35075,50 +35014,32 @@
       <w:pPr>
         <w:pStyle w:val="BodyText"/>
       </w:pPr>
-      <w:bookmarkStart w:id="91" w:name="ref18"/>
+      <w:bookmarkStart w:id="91" w:name="ref17"/>
       <w:r>
         <w:rPr>
           <w:b/>
           <w:bCs/>
         </w:rPr>
-        <w:t xml:space="preserve">[18]</w:t>
+        <w:t xml:space="preserve">[17]</w:t>
       </w:r>
       <w:bookmarkEnd w:id="91"/>
       <w:r>
         <w:t xml:space="preserve"> </w:t>
       </w:r>
       <w:r>
-        <w:t xml:space="preserve">R. Ai, Y. Pan, D. Simchi-Levi, M. Tambe, and H. Xu,</w:t>
-      </w:r>
-      <w:r>
-        <w:t xml:space="preserve"> </w:t>
-      </w:r>
-      <w:r>
-        <w:t xml:space="preserve">“Beyond majority voting: LLM aggregation by leveraging higher-order information,”</w:t>
-      </w:r>
-      <w:r>
-        <w:t xml:space="preserve"> </w:t>
-      </w:r>
-      <w:r>
-        <w:t xml:space="preserve">arXiv:2510.01499, </w:t>
-      </w:r>
-      <w:r>
-        <w:rPr>
-          <w:rFonts w:hint="eastAsia"/>
-        </w:rPr>
-        <w:t xml:space="preserve">2025（已獲</w:t>
-      </w:r>
-      <w:r>
-        <w:t xml:space="preserve"> ICML 2026 </w:t>
-      </w:r>
-      <w:r>
-        <w:rPr>
-          <w:rFonts w:hint="eastAsia"/>
-        </w:rPr>
-        <w:t xml:space="preserve">接受）.</w:t>
-      </w:r>
-      <w:r>
-        <w:t xml:space="preserve"> ·</w:t>
+        <w:t xml:space="preserve">J. Lee, V. Ma, S. Zhao, Y. Nair, A. Spector, R. Cohen, and E. J. Candès,</w:t>
+      </w:r>
+      <w:r>
+        <w:t xml:space="preserve"> </w:t>
+      </w:r>
+      <w:r>
+        <w:t xml:space="preserve">“FUSE: Ensembling verifiers with zero labeled data,”</w:t>
+      </w:r>
+      <w:r>
+        <w:t xml:space="preserve"> </w:t>
+      </w:r>
+      <w:r>
+        <w:t xml:space="preserve">arXiv:2604.18547, 2026. ·</w:t>
       </w:r>
       <w:r>
         <w:t xml:space="preserve"> </w:t>
@@ -35136,39 +35057,50 @@
       <w:pPr>
         <w:pStyle w:val="BodyText"/>
       </w:pPr>
-      <w:bookmarkStart w:id="93" w:name="ref19"/>
+      <w:bookmarkStart w:id="93" w:name="ref18"/>
       <w:r>
         <w:rPr>
           <w:b/>
           <w:bCs/>
         </w:rPr>
-        <w:t xml:space="preserve">[19]</w:t>
+        <w:t xml:space="preserve">[18]</w:t>
       </w:r>
       <w:bookmarkEnd w:id="93"/>
       <w:r>
         <w:t xml:space="preserve"> </w:t>
       </w:r>
       <w:r>
-        <w:t xml:space="preserve">P. van Elteren,</w:t>
-      </w:r>
-      <w:r>
-        <w:t xml:space="preserve"> </w:t>
-      </w:r>
-      <w:r>
-        <w:t xml:space="preserve">“On the combination of independent two-sample tests of Wilcoxon,”</w:t>
-      </w:r>
-      <w:r>
-        <w:t xml:space="preserve"> </w:t>
-      </w:r>
-      <w:r>
-        <w:rPr>
-          <w:i/>
-          <w:iCs/>
-        </w:rPr>
-        <w:t xml:space="preserve">Bull. Int. Statist. Inst.</w:t>
-      </w:r>
-      <w:r>
-        <w:t xml:space="preserve">, vol. 37, pp. 351–361, 1960. ·</w:t>
+        <w:t xml:space="preserve">R. Ai, Y. Pan, D. Simchi-Levi, M. Tambe, and H. Xu,</w:t>
+      </w:r>
+      <w:r>
+        <w:t xml:space="preserve"> </w:t>
+      </w:r>
+      <w:r>
+        <w:t xml:space="preserve">“Beyond majority voting: LLM aggregation by leveraging higher-order information,”</w:t>
+      </w:r>
+      <w:r>
+        <w:t xml:space="preserve"> </w:t>
+      </w:r>
+      <w:r>
+        <w:t xml:space="preserve">arXiv:2510.01499, </w:t>
+      </w:r>
+      <w:r>
+        <w:rPr>
+          <w:rFonts w:hint="eastAsia"/>
+        </w:rPr>
+        <w:t xml:space="preserve">2025（已獲</w:t>
+      </w:r>
+      <w:r>
+        <w:t xml:space="preserve"> ICML 2026 </w:t>
+      </w:r>
+      <w:r>
+        <w:rPr>
+          <w:rFonts w:hint="eastAsia"/>
+        </w:rPr>
+        <w:t xml:space="preserve">接受）.</w:t>
+      </w:r>
+      <w:r>
+        <w:t xml:space="preserve"> ·</w:t>
       </w:r>
       <w:r>
         <w:t xml:space="preserve"> </w:t>
@@ -35186,32 +35118,26 @@
       <w:pPr>
         <w:pStyle w:val="BodyText"/>
       </w:pPr>
-      <w:bookmarkStart w:id="95" w:name="ref20"/>
+      <w:bookmarkStart w:id="95" w:name="ref19"/>
       <w:r>
         <w:rPr>
           <w:b/>
           <w:bCs/>
         </w:rPr>
-        <w:t xml:space="preserve">[20]</w:t>
+        <w:t xml:space="preserve">[19]</w:t>
       </w:r>
       <w:bookmarkEnd w:id="95"/>
       <w:r>
         <w:t xml:space="preserve"> </w:t>
       </w:r>
       <w:r>
-        <w:t xml:space="preserve">W. James and C. Stein,</w:t>
-      </w:r>
-      <w:r>
-        <w:t xml:space="preserve"> </w:t>
-      </w:r>
-      <w:r>
-        <w:t xml:space="preserve">“Estimation with quadratic loss,”</w:t>
-      </w:r>
-      <w:r>
-        <w:t xml:space="preserve"> </w:t>
-      </w:r>
-      <w:r>
-        <w:t xml:space="preserve">in</w:t>
+        <w:t xml:space="preserve">P. van Elteren,</w:t>
+      </w:r>
+      <w:r>
+        <w:t xml:space="preserve"> </w:t>
+      </w:r>
+      <w:r>
+        <w:t xml:space="preserve">“On the combination of independent two-sample tests of Wilcoxon,”</w:t>
       </w:r>
       <w:r>
         <w:t xml:space="preserve"> </w:t>
@@ -35221,10 +35147,10 @@
           <w:i/>
           <w:iCs/>
         </w:rPr>
-        <w:t xml:space="preserve">Proc. 4th Berkeley Symp. Math. Statist. Prob.</w:t>
-      </w:r>
-      <w:r>
-        <w:t xml:space="preserve">, 1961, pp. 361–379. ·</w:t>
+        <w:t xml:space="preserve">Bull. Int. Statist. Inst.</w:t>
+      </w:r>
+      <w:r>
+        <w:t xml:space="preserve">, vol. 37, pp. 351–361, 1960. ·</w:t>
       </w:r>
       <w:r>
         <w:t xml:space="preserve"> </w:t>
@@ -35242,20 +35168,32 @@
       <w:pPr>
         <w:pStyle w:val="BodyText"/>
       </w:pPr>
-      <w:bookmarkStart w:id="97" w:name="ref21"/>
+      <w:bookmarkStart w:id="97" w:name="ref20"/>
       <w:r>
         <w:rPr>
           <w:b/>
           <w:bCs/>
         </w:rPr>
-        <w:t xml:space="preserve">[21]</w:t>
+        <w:t xml:space="preserve">[20]</w:t>
       </w:r>
       <w:bookmarkEnd w:id="97"/>
       <w:r>
         <w:t xml:space="preserve"> </w:t>
       </w:r>
       <w:r>
-        <w:t xml:space="preserve">L. Kish,</w:t>
+        <w:t xml:space="preserve">W. James and C. Stein,</w:t>
+      </w:r>
+      <w:r>
+        <w:t xml:space="preserve"> </w:t>
+      </w:r>
+      <w:r>
+        <w:t xml:space="preserve">“Estimation with quadratic loss,”</w:t>
+      </w:r>
+      <w:r>
+        <w:t xml:space="preserve"> </w:t>
+      </w:r>
+      <w:r>
+        <w:t xml:space="preserve">in</w:t>
       </w:r>
       <w:r>
         <w:t xml:space="preserve"> </w:t>
@@ -35265,10 +35203,10 @@
           <w:i/>
           <w:iCs/>
         </w:rPr>
-        <w:t xml:space="preserve">Survey Sampling</w:t>
-      </w:r>
-      <w:r>
-        <w:t xml:space="preserve">. New York, NY, USA: Wiley, 1965. ·</w:t>
+        <w:t xml:space="preserve">Proc. 4th Berkeley Symp. Math. Statist. Prob.</w:t>
+      </w:r>
+      <w:r>
+        <w:t xml:space="preserve">, 1961, pp. 361–379. ·</w:t>
       </w:r>
       <w:r>
         <w:t xml:space="preserve"> </w:t>
@@ -35286,26 +35224,20 @@
       <w:pPr>
         <w:pStyle w:val="BodyText"/>
       </w:pPr>
-      <w:bookmarkStart w:id="99" w:name="ref22"/>
+      <w:bookmarkStart w:id="99" w:name="ref21"/>
       <w:r>
         <w:rPr>
           <w:b/>
           <w:bCs/>
         </w:rPr>
-        <w:t xml:space="preserve">[22]</w:t>
+        <w:t xml:space="preserve">[21]</w:t>
       </w:r>
       <w:bookmarkEnd w:id="99"/>
       <w:r>
         <w:t xml:space="preserve"> </w:t>
       </w:r>
       <w:r>
-        <w:t xml:space="preserve">J. N. K. Rao and A. J. Scott,</w:t>
-      </w:r>
-      <w:r>
-        <w:t xml:space="preserve"> </w:t>
-      </w:r>
-      <w:r>
-        <w:t xml:space="preserve">“The analysis of categorical data from complex sample surveys,”</w:t>
+        <w:t xml:space="preserve">L. Kish,</w:t>
       </w:r>
       <w:r>
         <w:t xml:space="preserve"> </w:t>
@@ -35315,10 +35247,10 @@
           <w:i/>
           <w:iCs/>
         </w:rPr>
-        <w:t xml:space="preserve">J. Amer. Statist. Assoc.</w:t>
-      </w:r>
-      <w:r>
-        <w:t xml:space="preserve">, vol. 76, no. 374, pp. 221–230, 1981. ·</w:t>
+        <w:t xml:space="preserve">Survey Sampling</w:t>
+      </w:r>
+      <w:r>
+        <w:t xml:space="preserve">. New York, NY, USA: Wiley, 1965. ·</w:t>
       </w:r>
       <w:r>
         <w:t xml:space="preserve"> </w:t>
@@ -35336,20 +35268,26 @@
       <w:pPr>
         <w:pStyle w:val="BodyText"/>
       </w:pPr>
-      <w:bookmarkStart w:id="101" w:name="ref23"/>
+      <w:bookmarkStart w:id="101" w:name="ref22"/>
       <w:r>
         <w:rPr>
           <w:b/>
           <w:bCs/>
         </w:rPr>
-        <w:t xml:space="preserve">[23]</w:t>
+        <w:t xml:space="preserve">[22]</w:t>
       </w:r>
       <w:bookmarkEnd w:id="101"/>
       <w:r>
         <w:t xml:space="preserve"> </w:t>
       </w:r>
       <w:r>
-        <w:t xml:space="preserve">K. Cobbe</w:t>
+        <w:t xml:space="preserve">J. N. K. Rao and A. J. Scott,</w:t>
+      </w:r>
+      <w:r>
+        <w:t xml:space="preserve"> </w:t>
+      </w:r>
+      <w:r>
+        <w:t xml:space="preserve">“The analysis of categorical data from complex sample surveys,”</w:t>
       </w:r>
       <w:r>
         <w:t xml:space="preserve"> </w:t>
@@ -35359,22 +35297,10 @@
           <w:i/>
           <w:iCs/>
         </w:rPr>
-        <w:t xml:space="preserve">et al.</w:t>
-      </w:r>
-      <w:r>
-        <w:t xml:space="preserve">,</w:t>
-      </w:r>
-      <w:r>
-        <w:t xml:space="preserve"> </w:t>
-      </w:r>
-      <w:r>
-        <w:t xml:space="preserve">“Training verifiers to solve math word problems,”</w:t>
-      </w:r>
-      <w:r>
-        <w:t xml:space="preserve"> </w:t>
-      </w:r>
-      <w:r>
-        <w:t xml:space="preserve">arXiv:2110.14168, 2021. ·</w:t>
+        <w:t xml:space="preserve">J. Amer. Statist. Assoc.</w:t>
+      </w:r>
+      <w:r>
+        <w:t xml:space="preserve">, vol. 76, no. 374, pp. 221–230, 1981. ·</w:t>
       </w:r>
       <w:r>
         <w:t xml:space="preserve"> </w:t>
@@ -35392,32 +35318,20 @@
       <w:pPr>
         <w:pStyle w:val="BodyText"/>
       </w:pPr>
-      <w:bookmarkStart w:id="103" w:name="ref24"/>
+      <w:bookmarkStart w:id="103" w:name="ref23"/>
       <w:r>
         <w:rPr>
           <w:b/>
           <w:bCs/>
         </w:rPr>
-        <w:t xml:space="preserve">[24]</w:t>
+        <w:t xml:space="preserve">[23]</w:t>
       </w:r>
       <w:bookmarkEnd w:id="103"/>
       <w:r>
         <w:t xml:space="preserve"> </w:t>
       </w:r>
       <w:r>
-        <w:t xml:space="preserve">D. Hendrycks, C. Burns, S. Kadavath, A. Arora, S. Basart, E. Tang, D. Song, and J. Steinhardt,</w:t>
-      </w:r>
-      <w:r>
-        <w:t xml:space="preserve"> </w:t>
-      </w:r>
-      <w:r>
-        <w:t xml:space="preserve">“Measuring mathematical problem solving with the MATH dataset,”</w:t>
-      </w:r>
-      <w:r>
-        <w:t xml:space="preserve"> </w:t>
-      </w:r>
-      <w:r>
-        <w:t xml:space="preserve">in</w:t>
+        <w:t xml:space="preserve">K. Cobbe</w:t>
       </w:r>
       <w:r>
         <w:t xml:space="preserve"> </w:t>
@@ -35427,10 +35341,22 @@
           <w:i/>
           <w:iCs/>
         </w:rPr>
-        <w:t xml:space="preserve">Proc. NeurIPS Datasets and Benchmarks</w:t>
-      </w:r>
-      <w:r>
-        <w:t xml:space="preserve">, 2021. ·</w:t>
+        <w:t xml:space="preserve">et al.</w:t>
+      </w:r>
+      <w:r>
+        <w:t xml:space="preserve">,</w:t>
+      </w:r>
+      <w:r>
+        <w:t xml:space="preserve"> </w:t>
+      </w:r>
+      <w:r>
+        <w:t xml:space="preserve">“Training verifiers to solve math word problems,”</w:t>
+      </w:r>
+      <w:r>
+        <w:t xml:space="preserve"> </w:t>
+      </w:r>
+      <w:r>
+        <w:t xml:space="preserve">arXiv:2110.14168, 2021. ·</w:t>
       </w:r>
       <w:r>
         <w:t xml:space="preserve"> </w:t>
@@ -35448,26 +35374,26 @@
       <w:pPr>
         <w:pStyle w:val="BodyText"/>
       </w:pPr>
-      <w:bookmarkStart w:id="105" w:name="ref25"/>
+      <w:bookmarkStart w:id="105" w:name="ref24"/>
       <w:r>
         <w:rPr>
           <w:b/>
           <w:bCs/>
         </w:rPr>
-        <w:t xml:space="preserve">[25]</w:t>
+        <w:t xml:space="preserve">[24]</w:t>
       </w:r>
       <w:bookmarkEnd w:id="105"/>
       <w:r>
         <w:t xml:space="preserve"> </w:t>
       </w:r>
       <w:r>
-        <w:t xml:space="preserve">H. Lightman, V. Kosaraju, Y. Burda, H. Edwards, B. Baker, T. Lee, J. Leike, J. Schulman, I. Sutskever, and K. Cobbe,</w:t>
-      </w:r>
-      <w:r>
-        <w:t xml:space="preserve"> </w:t>
-      </w:r>
-      <w:r>
-        <w:t xml:space="preserve">“Let’s verify step by step,”</w:t>
+        <w:t xml:space="preserve">D. Hendrycks, C. Burns, S. Kadavath, A. Arora, S. Basart, E. Tang, D. Song, and J. Steinhardt,</w:t>
+      </w:r>
+      <w:r>
+        <w:t xml:space="preserve"> </w:t>
+      </w:r>
+      <w:r>
+        <w:t xml:space="preserve">“Measuring mathematical problem solving with the MATH dataset,”</w:t>
       </w:r>
       <w:r>
         <w:t xml:space="preserve"> </w:t>
@@ -35483,10 +35409,10 @@
           <w:i/>
           <w:iCs/>
         </w:rPr>
-        <w:t xml:space="preserve">Proc. ICLR</w:t>
-      </w:r>
-      <w:r>
-        <w:t xml:space="preserve">, 2024. ·</w:t>
+        <w:t xml:space="preserve">Proc. NeurIPS Datasets and Benchmarks</w:t>
+      </w:r>
+      <w:r>
+        <w:t xml:space="preserve">, 2021. ·</w:t>
       </w:r>
       <w:r>
         <w:t xml:space="preserve"> </w:t>
@@ -35504,32 +35430,45 @@
       <w:pPr>
         <w:pStyle w:val="BodyText"/>
       </w:pPr>
-      <w:bookmarkStart w:id="107" w:name="ref26"/>
+      <w:bookmarkStart w:id="107" w:name="ref25"/>
       <w:r>
         <w:rPr>
           <w:b/>
           <w:bCs/>
         </w:rPr>
-        <w:t xml:space="preserve">[26]</w:t>
+        <w:t xml:space="preserve">[25]</w:t>
       </w:r>
       <w:bookmarkEnd w:id="107"/>
       <w:r>
         <w:t xml:space="preserve"> </w:t>
       </w:r>
       <w:r>
-        <w:t xml:space="preserve">Y. Xia, W. Shen, Y. Wang, J. K. Liu, H. Sun, S. Wu, J. Hu, and X. Xu,</w:t>
-      </w:r>
-      <w:r>
-        <w:t xml:space="preserve"> </w:t>
-      </w:r>
-      <w:r>
-        <w:t xml:space="preserve">“LeetCodeDataset: A temporal dataset for robust evaluation and efficient training of code LLMs,”</w:t>
-      </w:r>
-      <w:r>
-        <w:t xml:space="preserve"> </w:t>
-      </w:r>
-      <w:r>
-        <w:t xml:space="preserve">arXiv:2504.14655, 2025. ·</w:t>
+        <w:t xml:space="preserve">H. Lightman, V. Kosaraju, Y. Burda, H. Edwards, B. Baker, T. Lee, J. Leike, J. Schulman, I. Sutskever, and K. Cobbe,</w:t>
+      </w:r>
+      <w:r>
+        <w:t xml:space="preserve"> </w:t>
+      </w:r>
+      <w:r>
+        <w:t xml:space="preserve">“Let’s verify step by step,”</w:t>
+      </w:r>
+      <w:r>
+        <w:t xml:space="preserve"> </w:t>
+      </w:r>
+      <w:r>
+        <w:t xml:space="preserve">in</w:t>
+      </w:r>
+      <w:r>
+        <w:t xml:space="preserve"> </w:t>
+      </w:r>
+      <w:r>
+        <w:rPr>
+          <w:i/>
+          <w:iCs/>
+        </w:rPr>
+        <w:t xml:space="preserve">Proc. ICLR</w:t>
+      </w:r>
+      <w:r>
+        <w:t xml:space="preserve">, 2024. ·</w:t>
       </w:r>
       <w:r>
         <w:t xml:space="preserve"> </w:t>
@@ -35547,45 +35486,32 @@
       <w:pPr>
         <w:pStyle w:val="BodyText"/>
       </w:pPr>
-      <w:bookmarkStart w:id="109" w:name="ref27"/>
+      <w:bookmarkStart w:id="109" w:name="ref26"/>
       <w:r>
         <w:rPr>
           <w:b/>
           <w:bCs/>
         </w:rPr>
-        <w:t xml:space="preserve">[27]</w:t>
+        <w:t xml:space="preserve">[26]</w:t>
       </w:r>
       <w:bookmarkEnd w:id="109"/>
       <w:r>
         <w:t xml:space="preserve"> </w:t>
       </w:r>
       <w:r>
-        <w:t xml:space="preserve">L. Kuhn, Y. Gal, and S. Farquhar,</w:t>
-      </w:r>
-      <w:r>
-        <w:t xml:space="preserve"> </w:t>
-      </w:r>
-      <w:r>
-        <w:t xml:space="preserve">“Semantic uncertainty: Linguistic invariances for uncertainty estimation in natural language generation,”</w:t>
-      </w:r>
-      <w:r>
-        <w:t xml:space="preserve"> </w:t>
-      </w:r>
-      <w:r>
-        <w:t xml:space="preserve">in</w:t>
-      </w:r>
-      <w:r>
-        <w:t xml:space="preserve"> </w:t>
-      </w:r>
-      <w:r>
-        <w:rPr>
-          <w:i/>
-          <w:iCs/>
-        </w:rPr>
-        <w:t xml:space="preserve">Proc. ICLR</w:t>
-      </w:r>
-      <w:r>
-        <w:t xml:space="preserve">, 2023. ·</w:t>
+        <w:t xml:space="preserve">Y. Xia, W. Shen, Y. Wang, J. K. Liu, H. Sun, S. Wu, J. Hu, and X. Xu,</w:t>
+      </w:r>
+      <w:r>
+        <w:t xml:space="preserve"> </w:t>
+      </w:r>
+      <w:r>
+        <w:t xml:space="preserve">“LeetCodeDataset: A temporal dataset for robust evaluation and efficient training of code LLMs,”</w:t>
+      </w:r>
+      <w:r>
+        <w:t xml:space="preserve"> </w:t>
+      </w:r>
+      <w:r>
+        <w:t xml:space="preserve">arXiv:2504.14655, 2025. ·</w:t>
       </w:r>
       <w:r>
         <w:t xml:space="preserve"> </w:t>
@@ -35599,8 +35525,64 @@
         </w:r>
       </w:hyperlink>
     </w:p>
-    <w:bookmarkEnd w:id="111"/>
-    <w:bookmarkEnd w:id="112"/>
+    <w:p>
+      <w:pPr>
+        <w:pStyle w:val="BodyText"/>
+      </w:pPr>
+      <w:bookmarkStart w:id="111" w:name="ref27"/>
+      <w:r>
+        <w:rPr>
+          <w:b/>
+          <w:bCs/>
+        </w:rPr>
+        <w:t xml:space="preserve">[27]</w:t>
+      </w:r>
+      <w:bookmarkEnd w:id="111"/>
+      <w:r>
+        <w:t xml:space="preserve"> </w:t>
+      </w:r>
+      <w:r>
+        <w:t xml:space="preserve">L. Kuhn, Y. Gal, and S. Farquhar,</w:t>
+      </w:r>
+      <w:r>
+        <w:t xml:space="preserve"> </w:t>
+      </w:r>
+      <w:r>
+        <w:t xml:space="preserve">“Semantic uncertainty: Linguistic invariances for uncertainty estimation in natural language generation,”</w:t>
+      </w:r>
+      <w:r>
+        <w:t xml:space="preserve"> </w:t>
+      </w:r>
+      <w:r>
+        <w:t xml:space="preserve">in</w:t>
+      </w:r>
+      <w:r>
+        <w:t xml:space="preserve"> </w:t>
+      </w:r>
+      <w:r>
+        <w:rPr>
+          <w:i/>
+          <w:iCs/>
+        </w:rPr>
+        <w:t xml:space="preserve">Proc. ICLR</w:t>
+      </w:r>
+      <w:r>
+        <w:t xml:space="preserve">, 2023. ·</w:t>
+      </w:r>
+      <w:r>
+        <w:t xml:space="preserve"> </w:t>
+      </w:r>
+      <w:hyperlink r:id="rId112">
+        <w:r>
+          <w:rPr>
+            <w:rStyle w:val="Hyperlink"/>
+          </w:rPr>
+          <w:t xml:space="preserve">PDF</w:t>
+        </w:r>
+      </w:hyperlink>
+    </w:p>
+    <w:bookmarkEnd w:id="113"/>
+    <w:bookmarkEnd w:id="114"/>
     <w:sectPr>
       <w:footnotePr>
         <w:numRestart w:val="eachSect"/>

</xml_diff>